<commit_message>
chore: add documentation for variables and field extraction schema from sample docx files
</commit_message>
<xml_diff>
--- a/backend-app/samples/FILE MAU HOP DONG CÒN LẠI/2.1 MAU HDONG - 0406 (TRIỂN LÃM + TIỆC).docx
+++ b/backend-app/samples/FILE MAU HOP DONG CÒN LẠI/2.1 MAU HDONG - 0406 (TRIỂN LÃM + TIỆC).docx
@@ -421,51 +421,66 @@
         </w:rPr>
       </w:pPr>
       <w:r>
-        <w:rPr>
-          <w:rFonts w:ascii="Times New Roman" w:hAnsi="Times New Roman"/>
-          <w:iCs/>
-          <w:sz w:val="26"/>
-          <w:szCs w:val="26"/>
-        </w:rPr>
-        <w:t xml:space="preserve">Hôm nay, ngày …. tháng… năm 2025, tại Công ty </w:t>
-      </w:r>
-      <w:r>
-        <w:rPr>
-          <w:rFonts w:ascii="Times New Roman" w:hAnsi="Times New Roman"/>
-          <w:iCs/>
+        <w:t>Hôm nay, ngày {NgayLapHD} tháng {ThangLapHD} năm {NamLapHD}, tại Công ty TNHH Giải Trí Hoàng Hải</w:t>
+      </w:r>
+    </w:p>
+    <w:p>
+      <w:pPr>
+        <w:shd w:val="clear" w:color="auto" w:fill="FFFFFF" w:themeFill="background1"/>
+        <w:spacing w:line="360" w:lineRule="auto"/>
+        <w:ind w:leftChars="100" w:left="320"/>
+        <w:rPr>
+          <w:rFonts w:ascii="Times New Roman" w:hAnsi="Times New Roman"/>
+          <w:b/>
+          <w:sz w:val="26"/>
+          <w:szCs w:val="26"/>
+        </w:rPr>
+      </w:pPr>
+      <w:r>
+        <w:rPr>
+          <w:rFonts w:ascii="Times New Roman" w:hAnsi="Times New Roman"/>
+          <w:b/>
+          <w:sz w:val="26"/>
+          <w:szCs w:val="26"/>
+        </w:rPr>
+        <w:t xml:space="preserve">BÊN A: </w:t>
+      </w:r>
+      <w:r>
+        <w:rPr>
+          <w:rFonts w:ascii="Times New Roman" w:hAnsi="Times New Roman"/>
+          <w:b/>
+          <w:sz w:val="26"/>
+          <w:szCs w:val="26"/>
+        </w:rPr>
+        <w:tab/>
+      </w:r>
+      <w:r>
+        <w:rPr>
+          <w:rFonts w:ascii="Times New Roman" w:hAnsi="Times New Roman"/>
+          <w:b/>
+          <w:sz w:val="26"/>
+          <w:szCs w:val="26"/>
+        </w:rPr>
+        <w:tab/>
+      </w:r>
+      <w:r>
+        <w:rPr>
+          <w:rFonts w:ascii="Times New Roman" w:hAnsi="Times New Roman"/>
+          <w:b/>
           <w:sz w:val="26"/>
           <w:szCs w:val="26"/>
           <w:lang w:val="fr-FR"/>
         </w:rPr>
-        <w:t>T</w:t>
-      </w:r>
-      <w:r>
-        <w:rPr>
-          <w:rFonts w:ascii="Times New Roman" w:hAnsi="Times New Roman"/>
-          <w:iCs/>
-          <w:sz w:val="26"/>
-          <w:szCs w:val="26"/>
-        </w:rPr>
-        <w:t>NHH</w:t>
-      </w:r>
-      <w:r>
-        <w:rPr>
-          <w:rFonts w:ascii="Times New Roman" w:hAnsi="Times New Roman"/>
-          <w:iCs/>
-          <w:sz w:val="26"/>
-          <w:szCs w:val="26"/>
-          <w:lang w:val="fr-FR"/>
-        </w:rPr>
-        <w:t xml:space="preserve"> </w:t>
-      </w:r>
-      <w:r>
-        <w:rPr>
-          <w:rFonts w:ascii="Times New Roman" w:hAnsi="Times New Roman"/>
-          <w:iCs/>
-          <w:sz w:val="26"/>
-          <w:szCs w:val="26"/>
-        </w:rPr>
-        <w:t>Giải Trí Hoàng Hải</w:t>
+        <w:t xml:space="preserve">CÔNG TY TNHH </w:t>
+      </w:r>
+      <w:r>
+        <w:rPr>
+          <w:rFonts w:ascii="Times New Roman" w:hAnsi="Times New Roman"/>
+          <w:b/>
+          <w:sz w:val="26"/>
+          <w:szCs w:val="26"/>
+        </w:rPr>
+        <w:t>GIẢI TRÍ HOÀNG HẢI</w:t>
       </w:r>
     </w:p>
     <w:p>
@@ -481,91 +496,10 @@
         </w:rPr>
       </w:pPr>
       <w:r>
-        <w:rPr>
-          <w:rFonts w:ascii="Times New Roman" w:hAnsi="Times New Roman"/>
-          <w:b/>
-          <w:sz w:val="26"/>
-          <w:szCs w:val="26"/>
-        </w:rPr>
-        <w:t xml:space="preserve">BÊN A: </w:t>
-      </w:r>
-      <w:r>
-        <w:rPr>
-          <w:rFonts w:ascii="Times New Roman" w:hAnsi="Times New Roman"/>
-          <w:b/>
-          <w:sz w:val="26"/>
-          <w:szCs w:val="26"/>
-        </w:rPr>
+        <w:t>Đại Diện</w:t>
         <w:tab/>
-      </w:r>
-      <w:r>
-        <w:rPr>
-          <w:rFonts w:ascii="Times New Roman" w:hAnsi="Times New Roman"/>
-          <w:b/>
-          <w:sz w:val="26"/>
-          <w:szCs w:val="26"/>
-        </w:rPr>
         <w:tab/>
-      </w:r>
-      <w:r>
-        <w:rPr>
-          <w:rFonts w:ascii="Times New Roman" w:hAnsi="Times New Roman"/>
-          <w:b/>
-          <w:sz w:val="26"/>
-          <w:szCs w:val="26"/>
-          <w:lang w:val="fr-FR"/>
-        </w:rPr>
-        <w:t xml:space="preserve">CÔNG TY TNHH </w:t>
-      </w:r>
-      <w:r>
-        <w:rPr>
-          <w:rFonts w:ascii="Times New Roman" w:hAnsi="Times New Roman"/>
-          <w:b/>
-          <w:sz w:val="26"/>
-          <w:szCs w:val="26"/>
-        </w:rPr>
-        <w:t>GIẢI TRÍ HOÀNG HẢI</w:t>
-      </w:r>
-    </w:p>
-    <w:p>
-      <w:pPr>
-        <w:shd w:val="clear" w:color="auto" w:fill="FFFFFF" w:themeFill="background1"/>
-        <w:spacing w:line="360" w:lineRule="auto"/>
-        <w:ind w:leftChars="100" w:left="320"/>
-        <w:rPr>
-          <w:rFonts w:ascii="Times New Roman" w:hAnsi="Times New Roman"/>
-          <w:b/>
-          <w:sz w:val="26"/>
-          <w:szCs w:val="26"/>
-        </w:rPr>
-      </w:pPr>
-      <w:bookmarkStart w:id="0" w:name="_Hlk135660413"/>
-      <w:r>
-        <w:rPr>
-          <w:rFonts w:ascii="Times New Roman" w:hAnsi="Times New Roman"/>
-          <w:sz w:val="26"/>
-          <w:szCs w:val="26"/>
-        </w:rPr>
-        <w:t>Đại Diện</w:t>
-      </w:r>
-      <w:r>
-        <w:rPr>
-          <w:rFonts w:ascii="Times New Roman" w:hAnsi="Times New Roman"/>
-          <w:b/>
-          <w:sz w:val="26"/>
-          <w:szCs w:val="26"/>
-        </w:rPr>
-        <w:tab/>
-      </w:r>
-      <w:r>
-        <w:rPr>
-          <w:rFonts w:ascii="Times New Roman" w:hAnsi="Times New Roman"/>
-          <w:b/>
-          <w:sz w:val="26"/>
-          <w:szCs w:val="26"/>
-        </w:rPr>
-        <w:tab/>
-        <w:t>Ông</w:t>
+        <w:t>Ông/Bà {BenB_TenDaiDien}</w:t>
       </w:r>
     </w:p>
     <w:p>
@@ -746,22 +680,10 @@
         </w:rPr>
       </w:pPr>
       <w:r>
-        <w:rPr>
-          <w:rFonts w:ascii="Times New Roman" w:hAnsi="Times New Roman"/>
-          <w:b/>
-          <w:sz w:val="26"/>
-          <w:szCs w:val="26"/>
-        </w:rPr>
-        <w:t xml:space="preserve">BÊN B: </w:t>
-      </w:r>
-      <w:r>
-        <w:rPr>
-          <w:rFonts w:ascii="Times New Roman" w:hAnsi="Times New Roman"/>
-          <w:b/>
-          <w:sz w:val="26"/>
-          <w:szCs w:val="26"/>
-        </w:rPr>
+        <w:t>BÊN B:</w:t>
         <w:tab/>
+        <w:tab/>
+        <w:t>{BenB_TenChuTiec}</w:t>
       </w:r>
     </w:p>
     <w:p>
@@ -777,31 +699,10 @@
         </w:rPr>
       </w:pPr>
       <w:r>
-        <w:rPr>
-          <w:rFonts w:ascii="Times New Roman" w:hAnsi="Times New Roman"/>
-          <w:sz w:val="26"/>
-          <w:szCs w:val="26"/>
-        </w:rPr>
         <w:t>Đại Diện</w:t>
-      </w:r>
-      <w:r>
-        <w:rPr>
-          <w:rFonts w:ascii="Times New Roman" w:hAnsi="Times New Roman"/>
-          <w:b/>
-          <w:sz w:val="26"/>
-          <w:szCs w:val="26"/>
-        </w:rPr>
         <w:tab/>
-      </w:r>
-      <w:r>
-        <w:rPr>
-          <w:rFonts w:ascii="Times New Roman" w:hAnsi="Times New Roman"/>
-          <w:b/>
-          <w:sz w:val="26"/>
-          <w:szCs w:val="26"/>
-        </w:rPr>
         <w:tab/>
-        <w:t>Ông</w:t>
+        <w:t>Ông/Bà {BenB_TenDaiDien}</w:t>
       </w:r>
     </w:p>
     <w:p>
@@ -816,29 +717,10 @@
         </w:rPr>
       </w:pPr>
       <w:r>
-        <w:rPr>
-          <w:rFonts w:ascii="Times New Roman" w:hAnsi="Times New Roman"/>
-          <w:bCs/>
-          <w:sz w:val="26"/>
-          <w:szCs w:val="26"/>
-        </w:rPr>
         <w:t>Chức Vụ</w:t>
-      </w:r>
-      <w:r>
-        <w:rPr>
-          <w:rFonts w:ascii="Times New Roman" w:hAnsi="Times New Roman"/>
-          <w:sz w:val="26"/>
-          <w:szCs w:val="26"/>
-        </w:rPr>
         <w:tab/>
-      </w:r>
-      <w:r>
-        <w:rPr>
-          <w:rFonts w:ascii="Times New Roman" w:hAnsi="Times New Roman"/>
-          <w:sz w:val="26"/>
-          <w:szCs w:val="26"/>
-        </w:rPr>
         <w:tab/>
+        <w:t>{BenB_ChucVu}</w:t>
       </w:r>
     </w:p>
     <w:p>
@@ -853,28 +735,10 @@
         </w:rPr>
       </w:pPr>
       <w:r>
-        <w:rPr>
-          <w:rFonts w:ascii="Times New Roman" w:hAnsi="Times New Roman"/>
-          <w:sz w:val="26"/>
-          <w:szCs w:val="26"/>
-        </w:rPr>
         <w:t>Địa Chỉ</w:t>
-      </w:r>
-      <w:r>
-        <w:rPr>
-          <w:rFonts w:ascii="Times New Roman" w:hAnsi="Times New Roman"/>
-          <w:sz w:val="26"/>
-          <w:szCs w:val="26"/>
-        </w:rPr>
         <w:tab/>
-      </w:r>
-      <w:r>
-        <w:rPr>
-          <w:rFonts w:ascii="Times New Roman" w:hAnsi="Times New Roman"/>
-          <w:sz w:val="26"/>
-          <w:szCs w:val="26"/>
-        </w:rPr>
         <w:tab/>
+        <w:t>{BenB_DiaChi}</w:t>
       </w:r>
     </w:p>
     <w:p>
@@ -889,28 +753,10 @@
         </w:rPr>
       </w:pPr>
       <w:r>
-        <w:rPr>
-          <w:rFonts w:ascii="Times New Roman" w:hAnsi="Times New Roman"/>
-          <w:sz w:val="26"/>
-          <w:szCs w:val="26"/>
-        </w:rPr>
         <w:t>Điện thoại</w:t>
-      </w:r>
-      <w:r>
-        <w:rPr>
-          <w:rFonts w:ascii="Times New Roman" w:hAnsi="Times New Roman"/>
-          <w:sz w:val="26"/>
-          <w:szCs w:val="26"/>
-        </w:rPr>
         <w:tab/>
-      </w:r>
-      <w:r>
-        <w:rPr>
-          <w:rFonts w:ascii="Times New Roman" w:hAnsi="Times New Roman"/>
-          <w:sz w:val="26"/>
-          <w:szCs w:val="26"/>
-        </w:rPr>
         <w:tab/>
+        <w:t>{BenB_DienThoai}</w:t>
       </w:r>
     </w:p>
     <w:p>
@@ -925,12 +771,10 @@
         </w:rPr>
       </w:pPr>
       <w:r>
-        <w:rPr>
-          <w:rFonts w:ascii="Times New Roman" w:hAnsi="Times New Roman"/>
-          <w:sz w:val="26"/>
-          <w:szCs w:val="26"/>
-        </w:rPr>
-        <w:t xml:space="preserve">MST </w:t>
+        <w:t>MST</w:t>
+        <w:tab/>
+        <w:tab/>
+        <w:t>{BenB_CCCD}</w:t>
       </w:r>
     </w:p>
     <w:p>
@@ -1089,24 +933,100 @@
         </w:rPr>
       </w:pPr>
       <w:r>
+        <w:t>- Địa điểm triển lãm: {Tiec_SanhTiec} - Booth trưng bày triển lãm</w:t>
+      </w:r>
+    </w:p>
+    <w:p>
+      <w:pPr>
+        <w:shd w:val="clear" w:color="auto" w:fill="FFFFFF" w:themeFill="background1"/>
+        <w:spacing w:line="360" w:lineRule="auto"/>
+        <w:ind w:leftChars="100" w:left="320"/>
         <w:rPr>
           <w:rFonts w:ascii="Times New Roman" w:eastAsia="SimSun" w:hAnsi="Times New Roman"/>
           <w:sz w:val="26"/>
           <w:szCs w:val="26"/>
           <w:lang w:eastAsia="zh-CN" w:bidi="ar"/>
         </w:rPr>
-        <w:t xml:space="preserve">- </w:t>
-      </w:r>
-      <w:r>
+      </w:pPr>
+      <w:r>
+        <w:t>+ Số lượng khách tham quan dự kiến: {SoKhachDiemDanh} khách</w:t>
+      </w:r>
+    </w:p>
+    <w:p>
+      <w:pPr>
+        <w:shd w:val="clear" w:color="auto" w:fill="FFFFFF" w:themeFill="background1"/>
+        <w:spacing w:line="360" w:lineRule="auto"/>
+        <w:ind w:leftChars="100" w:left="320"/>
         <w:rPr>
           <w:rFonts w:ascii="Times New Roman" w:eastAsia="SimSun" w:hAnsi="Times New Roman"/>
+          <w:sz w:val="26"/>
+          <w:szCs w:val="26"/>
+          <w:lang w:eastAsia="zh-CN" w:bidi="ar"/>
+        </w:rPr>
+      </w:pPr>
+      <w:r>
+        <w:t>+ Thời gian setup, thi công và dàn dựng triển lãm: Từ {SetupBatDau} - {SetupKetThuc} vào Ngày {NgayLapHD} tháng {ThangLapHD} năm {NamLapHD}</w:t>
+      </w:r>
+    </w:p>
+    <w:p>
+      <w:pPr>
+        <w:shd w:val="clear" w:color="auto" w:fill="FFFFFF" w:themeFill="background1"/>
+        <w:spacing w:line="360" w:lineRule="auto"/>
+        <w:ind w:leftChars="100" w:left="320"/>
+        <w:rPr>
+          <w:rFonts w:ascii="Times New Roman" w:eastAsia="SimSun" w:hAnsi="Times New Roman"/>
+          <w:sz w:val="26"/>
+          <w:szCs w:val="26"/>
+          <w:lang w:eastAsia="zh-CN" w:bidi="ar"/>
+        </w:rPr>
+      </w:pPr>
+      <w:r>
+        <w:t>+ Thời gian diễn ra triển lãm: Từ {Tiec_GioBatDau} - {Tiec_GioKetThuc} vào Ngày {NgayLapHD} tháng {ThangLapHD} năm {NamLapHD}</w:t>
+      </w:r>
+    </w:p>
+    <w:p>
+      <w:pPr>
+        <w:shd w:val="clear" w:color="auto" w:fill="FFFFFF" w:themeFill="background1"/>
+        <w:spacing w:line="360" w:lineRule="auto"/>
+        <w:ind w:leftChars="100" w:left="320"/>
+        <w:rPr>
+          <w:rFonts w:ascii="Times New Roman" w:eastAsia="SimSun" w:hAnsi="Times New Roman"/>
+          <w:sz w:val="26"/>
+          <w:szCs w:val="26"/>
+          <w:lang w:eastAsia="zh-CN" w:bidi="ar"/>
+        </w:rPr>
+      </w:pPr>
+      <w:r>
+        <w:rPr>
+          <w:rFonts w:ascii="Times New Roman" w:eastAsia="SimSun" w:hAnsi="Times New Roman"/>
+          <w:sz w:val="26"/>
+          <w:szCs w:val="26"/>
+          <w:lang w:eastAsia="zh-CN" w:bidi="ar"/>
+        </w:rPr>
+        <w:t>+ Thời gian tháo dỡ, di dời thiết bị, hàng hóa triển lãm: theo lịch được Bên A chấp thuận.</w:t>
+      </w:r>
+    </w:p>
+    <w:p>
+      <w:pPr>
+        <w:shd w:val="clear" w:color="auto" w:fill="FFFFFF" w:themeFill="background1"/>
+        <w:spacing w:line="360" w:lineRule="auto"/>
+        <w:ind w:leftChars="100" w:left="320"/>
+        <w:rPr>
+          <w:rFonts w:ascii="Times New Roman" w:hAnsi="Times New Roman"/>
+          <w:sz w:val="26"/>
+          <w:szCs w:val="26"/>
+        </w:rPr>
+      </w:pPr>
+      <w:r>
+        <w:rPr>
+          <w:rFonts w:ascii="Times New Roman" w:eastAsia="SimSun" w:hAnsi="Times New Roman"/>
           <w:b/>
           <w:bCs/>
           <w:sz w:val="26"/>
           <w:szCs w:val="26"/>
           <w:lang w:eastAsia="zh-CN" w:bidi="ar"/>
         </w:rPr>
-        <w:t>Địa điểm triển lãm</w:t>
+        <w:t>- Địa điểm tiệc tối</w:t>
       </w:r>
       <w:r>
         <w:rPr>
@@ -1115,7 +1035,7 @@
           <w:szCs w:val="26"/>
           <w:lang w:eastAsia="zh-CN" w:bidi="ar"/>
         </w:rPr>
-        <w:t>: Sảnh Lux ABCD - Booth trưng bày triển lãm</w:t>
+        <w:t>: Lux E</w:t>
       </w:r>
     </w:p>
     <w:p>
@@ -1137,17 +1057,21 @@
           <w:szCs w:val="26"/>
           <w:lang w:eastAsia="zh-CN" w:bidi="ar"/>
         </w:rPr>
-        <w:t xml:space="preserve">+ Số lượng khách </w:t>
-      </w:r>
-      <w:r>
+        <w:t xml:space="preserve">+ Số lượng bàn chính thức: 28 bàn </w:t>
+      </w:r>
+    </w:p>
+    <w:p>
+      <w:pPr>
+        <w:shd w:val="clear" w:color="auto" w:fill="FFFFFF" w:themeFill="background1"/>
+        <w:spacing w:line="360" w:lineRule="auto"/>
+        <w:ind w:leftChars="100" w:left="320"/>
         <w:rPr>
           <w:rFonts w:ascii="Times New Roman" w:eastAsia="SimSun" w:hAnsi="Times New Roman"/>
           <w:sz w:val="26"/>
           <w:szCs w:val="26"/>
           <w:lang w:eastAsia="zh-CN" w:bidi="ar"/>
         </w:rPr>
-        <w:t>tham quan dự kiến</w:t>
-      </w:r>
+      </w:pPr>
       <w:r>
         <w:rPr>
           <w:rFonts w:ascii="Times New Roman" w:eastAsia="SimSun" w:hAnsi="Times New Roman"/>
@@ -1155,15 +1079,7 @@
           <w:szCs w:val="26"/>
           <w:lang w:eastAsia="zh-CN" w:bidi="ar"/>
         </w:rPr>
-        <w:t xml:space="preserve">: </w:t>
-      </w:r>
-      <w:r>
-        <w:rPr>
-          <w:rFonts w:ascii="Times New Roman" w:hAnsi="Times New Roman"/>
-          <w:sz w:val="26"/>
-          <w:szCs w:val="26"/>
-        </w:rPr>
-        <w:t>500 khách</w:t>
+        <w:t xml:space="preserve">+ Số lượng bàn dự phòng: 02 bàn </w:t>
       </w:r>
     </w:p>
     <w:p>
@@ -1179,53 +1095,37 @@
         </w:rPr>
       </w:pPr>
       <w:r>
-        <w:rPr>
-          <w:rFonts w:ascii="Times New Roman" w:eastAsia="SimSun" w:hAnsi="Times New Roman"/>
-          <w:sz w:val="26"/>
-          <w:szCs w:val="26"/>
-          <w:lang w:eastAsia="zh-CN" w:bidi="ar"/>
-        </w:rPr>
-        <w:t>+ Thời gian setup</w:t>
-      </w:r>
-      <w:r>
-        <w:rPr>
-          <w:rFonts w:ascii="Times New Roman" w:eastAsia="SimSun" w:hAnsi="Times New Roman"/>
-          <w:sz w:val="26"/>
-          <w:szCs w:val="26"/>
-          <w:lang w:eastAsia="zh-CN" w:bidi="ar"/>
-        </w:rPr>
-        <w:t xml:space="preserve">, thi công và dàn dựng </w:t>
-      </w:r>
-      <w:r>
-        <w:rPr>
-          <w:rFonts w:ascii="Times New Roman" w:eastAsia="SimSun" w:hAnsi="Times New Roman"/>
-          <w:sz w:val="26"/>
-          <w:szCs w:val="26"/>
-          <w:lang w:eastAsia="zh-CN" w:bidi="ar"/>
-        </w:rPr>
-        <w:t>triển lãm: Từ 08h00 - 18h00 vào Ngày….tháng….năm</w:t>
-      </w:r>
-    </w:p>
-    <w:p>
-      <w:pPr>
+        <w:t>- Thời gian tiệc: {Tiec_GioBatDau} – {Tiec_GioKetThuc}, Ngày {NgayLapHD}</w:t>
+      </w:r>
+    </w:p>
+    <w:p>
+      <w:pPr>
+        <w:numPr>
+          <w:ilvl w:val="0"/>
+          <w:numId w:val="2"/>
+        </w:numPr>
         <w:shd w:val="clear" w:color="auto" w:fill="FFFFFF" w:themeFill="background1"/>
         <w:spacing w:line="360" w:lineRule="auto"/>
         <w:ind w:leftChars="100" w:left="320"/>
         <w:rPr>
-          <w:rFonts w:ascii="Times New Roman" w:eastAsia="SimSun" w:hAnsi="Times New Roman"/>
-          <w:sz w:val="26"/>
-          <w:szCs w:val="26"/>
-          <w:lang w:eastAsia="zh-CN" w:bidi="ar"/>
-        </w:rPr>
-      </w:pPr>
-      <w:r>
-        <w:rPr>
-          <w:rFonts w:ascii="Times New Roman" w:eastAsia="SimSun" w:hAnsi="Times New Roman"/>
-          <w:sz w:val="26"/>
-          <w:szCs w:val="26"/>
-          <w:lang w:eastAsia="zh-CN" w:bidi="ar"/>
-        </w:rPr>
-        <w:t>+ Thời gian diễn ra triển lãm: Từ 08h00 - 17h00 vào Ngày….tháng….năm</w:t>
+          <w:rFonts w:ascii="Times New Roman" w:eastAsia="TimesNewRomanPS-BoldMT" w:hAnsi="Times New Roman"/>
+          <w:b/>
+          <w:bCs/>
+          <w:sz w:val="26"/>
+          <w:szCs w:val="26"/>
+          <w:lang w:eastAsia="zh-CN" w:bidi="ar"/>
+        </w:rPr>
+      </w:pPr>
+      <w:r>
+        <w:rPr>
+          <w:rFonts w:ascii="Times New Roman" w:eastAsia="TimesNewRomanPS-BoldMT" w:hAnsi="Times New Roman"/>
+          <w:b/>
+          <w:bCs/>
+          <w:sz w:val="26"/>
+          <w:szCs w:val="26"/>
+          <w:lang w:eastAsia="zh-CN" w:bidi="ar"/>
+        </w:rPr>
+        <w:t xml:space="preserve">Đơn giá các dịch vụ được cung cấp: </w:t>
       </w:r>
     </w:p>
     <w:p>
@@ -1234,20 +1134,46 @@
         <w:spacing w:line="360" w:lineRule="auto"/>
         <w:ind w:leftChars="100" w:left="320"/>
         <w:rPr>
-          <w:rFonts w:ascii="Times New Roman" w:eastAsia="SimSun" w:hAnsi="Times New Roman"/>
-          <w:sz w:val="26"/>
-          <w:szCs w:val="26"/>
-          <w:lang w:eastAsia="zh-CN" w:bidi="ar"/>
-        </w:rPr>
-      </w:pPr>
-      <w:r>
-        <w:rPr>
-          <w:rFonts w:ascii="Times New Roman" w:eastAsia="SimSun" w:hAnsi="Times New Roman"/>
-          <w:sz w:val="26"/>
-          <w:szCs w:val="26"/>
-          <w:lang w:eastAsia="zh-CN" w:bidi="ar"/>
-        </w:rPr>
-        <w:t>+ Thời gian tháo dỡ, di dời thiết bị, hàng hóa triển lãm: theo lịch được Bên A chấp thuận.</w:t>
+          <w:rFonts w:ascii="Times New Roman" w:eastAsia="TimesNewRomanPS-BoldMT" w:hAnsi="Times New Roman"/>
+          <w:b/>
+          <w:bCs/>
+          <w:sz w:val="26"/>
+          <w:szCs w:val="26"/>
+          <w:lang w:eastAsia="zh-CN" w:bidi="ar"/>
+        </w:rPr>
+      </w:pPr>
+      <w:r>
+        <w:rPr>
+          <w:rFonts w:ascii="Times New Roman" w:eastAsia="TimesNewRomanPS-BoldMT" w:hAnsi="Times New Roman"/>
+          <w:b/>
+          <w:bCs/>
+          <w:sz w:val="26"/>
+          <w:szCs w:val="26"/>
+          <w:lang w:eastAsia="zh-CN" w:bidi="ar"/>
+        </w:rPr>
+        <w:t xml:space="preserve">2.1 Các dịch vụ </w:t>
+      </w:r>
+      <w:r>
+        <w:rPr>
+          <w:rFonts w:ascii="Times New Roman" w:eastAsia="TimesNewRomanPS-BoldMT" w:hAnsi="Times New Roman"/>
+          <w:b/>
+          <w:bCs/>
+          <w:sz w:val="26"/>
+          <w:szCs w:val="26"/>
+          <w:lang w:eastAsia="zh-CN" w:bidi="ar"/>
+        </w:rPr>
+        <w:t>ưu đãi/tặng kèm</w:t>
+      </w:r>
+      <w:r>
+        <w:rPr>
+          <w:rFonts w:ascii="Times New Roman" w:eastAsia="TimesNewRomanPS-BoldMT" w:hAnsi="Times New Roman"/>
+          <w:b/>
+          <w:bCs/>
+          <w:sz w:val="26"/>
+          <w:szCs w:val="26"/>
+          <w:lang w:eastAsia="zh-CN" w:bidi="ar"/>
+        </w:rPr>
+        <w:t xml:space="preserve"> bao gồm: </w:t>
       </w:r>
     </w:p>
     <w:p>
@@ -1263,191 +1189,6 @@
       </w:pPr>
       <w:r>
         <w:rPr>
-          <w:rFonts w:ascii="Times New Roman" w:eastAsia="SimSun" w:hAnsi="Times New Roman"/>
-          <w:b/>
-          <w:bCs/>
-          <w:sz w:val="26"/>
-          <w:szCs w:val="26"/>
-          <w:lang w:eastAsia="zh-CN" w:bidi="ar"/>
-        </w:rPr>
-        <w:t>- Địa điểm tiệc tối</w:t>
-      </w:r>
-      <w:r>
-        <w:rPr>
-          <w:rFonts w:ascii="Times New Roman" w:eastAsia="SimSun" w:hAnsi="Times New Roman"/>
-          <w:sz w:val="26"/>
-          <w:szCs w:val="26"/>
-          <w:lang w:eastAsia="zh-CN" w:bidi="ar"/>
-        </w:rPr>
-        <w:t>: Lux E</w:t>
-      </w:r>
-    </w:p>
-    <w:p>
-      <w:pPr>
-        <w:shd w:val="clear" w:color="auto" w:fill="FFFFFF" w:themeFill="background1"/>
-        <w:spacing w:line="360" w:lineRule="auto"/>
-        <w:ind w:leftChars="100" w:left="320"/>
-        <w:rPr>
-          <w:rFonts w:ascii="Times New Roman" w:eastAsia="SimSun" w:hAnsi="Times New Roman"/>
-          <w:sz w:val="26"/>
-          <w:szCs w:val="26"/>
-          <w:lang w:eastAsia="zh-CN" w:bidi="ar"/>
-        </w:rPr>
-      </w:pPr>
-      <w:r>
-        <w:rPr>
-          <w:rFonts w:ascii="Times New Roman" w:eastAsia="SimSun" w:hAnsi="Times New Roman"/>
-          <w:sz w:val="26"/>
-          <w:szCs w:val="26"/>
-          <w:lang w:eastAsia="zh-CN" w:bidi="ar"/>
-        </w:rPr>
-        <w:t xml:space="preserve">+ Số lượng bàn chính thức: 28 bàn </w:t>
-      </w:r>
-    </w:p>
-    <w:p>
-      <w:pPr>
-        <w:shd w:val="clear" w:color="auto" w:fill="FFFFFF" w:themeFill="background1"/>
-        <w:spacing w:line="360" w:lineRule="auto"/>
-        <w:ind w:leftChars="100" w:left="320"/>
-        <w:rPr>
-          <w:rFonts w:ascii="Times New Roman" w:eastAsia="SimSun" w:hAnsi="Times New Roman"/>
-          <w:sz w:val="26"/>
-          <w:szCs w:val="26"/>
-          <w:lang w:eastAsia="zh-CN" w:bidi="ar"/>
-        </w:rPr>
-      </w:pPr>
-      <w:r>
-        <w:rPr>
-          <w:rFonts w:ascii="Times New Roman" w:eastAsia="SimSun" w:hAnsi="Times New Roman"/>
-          <w:sz w:val="26"/>
-          <w:szCs w:val="26"/>
-          <w:lang w:eastAsia="zh-CN" w:bidi="ar"/>
-        </w:rPr>
-        <w:t xml:space="preserve">+ Số lượng bàn dự phòng: 02 bàn </w:t>
-      </w:r>
-    </w:p>
-    <w:p>
-      <w:pPr>
-        <w:shd w:val="clear" w:color="auto" w:fill="FFFFFF" w:themeFill="background1"/>
-        <w:spacing w:line="360" w:lineRule="auto"/>
-        <w:ind w:leftChars="100" w:left="320"/>
-        <w:rPr>
-          <w:rFonts w:ascii="Times New Roman" w:eastAsia="SimSun" w:hAnsi="Times New Roman"/>
-          <w:sz w:val="26"/>
-          <w:szCs w:val="26"/>
-          <w:lang w:eastAsia="zh-CN" w:bidi="ar"/>
-        </w:rPr>
-      </w:pPr>
-      <w:r>
-        <w:rPr>
-          <w:rFonts w:ascii="Times New Roman" w:eastAsia="SimSun" w:hAnsi="Times New Roman"/>
-          <w:sz w:val="26"/>
-          <w:szCs w:val="26"/>
-          <w:lang w:eastAsia="zh-CN" w:bidi="ar"/>
-        </w:rPr>
-        <w:t>+ Thời gian tiệc: Từ 18h00 - 22h00</w:t>
-      </w:r>
-      <w:r>
-        <w:rPr>
-          <w:rFonts w:ascii="Times New Roman" w:eastAsia="SimSun" w:hAnsi="Times New Roman"/>
-          <w:sz w:val="26"/>
-          <w:szCs w:val="26"/>
-          <w:lang w:eastAsia="zh-CN" w:bidi="ar"/>
-        </w:rPr>
-        <w:t xml:space="preserve"> ngày….tháng ……...năm…..</w:t>
-      </w:r>
-    </w:p>
-    <w:p>
-      <w:pPr>
-        <w:numPr>
-          <w:ilvl w:val="0"/>
-          <w:numId w:val="2"/>
-        </w:numPr>
-        <w:shd w:val="clear" w:color="auto" w:fill="FFFFFF" w:themeFill="background1"/>
-        <w:spacing w:line="360" w:lineRule="auto"/>
-        <w:ind w:leftChars="100" w:left="320"/>
-        <w:rPr>
-          <w:rFonts w:ascii="Times New Roman" w:eastAsia="TimesNewRomanPS-BoldMT" w:hAnsi="Times New Roman"/>
-          <w:b/>
-          <w:bCs/>
-          <w:sz w:val="26"/>
-          <w:szCs w:val="26"/>
-          <w:lang w:eastAsia="zh-CN" w:bidi="ar"/>
-        </w:rPr>
-      </w:pPr>
-      <w:r>
-        <w:rPr>
-          <w:rFonts w:ascii="Times New Roman" w:eastAsia="TimesNewRomanPS-BoldMT" w:hAnsi="Times New Roman"/>
-          <w:b/>
-          <w:bCs/>
-          <w:sz w:val="26"/>
-          <w:szCs w:val="26"/>
-          <w:lang w:eastAsia="zh-CN" w:bidi="ar"/>
-        </w:rPr>
-        <w:t xml:space="preserve">Đơn giá các dịch vụ được cung cấp: </w:t>
-      </w:r>
-    </w:p>
-    <w:p>
-      <w:pPr>
-        <w:shd w:val="clear" w:color="auto" w:fill="FFFFFF" w:themeFill="background1"/>
-        <w:spacing w:line="360" w:lineRule="auto"/>
-        <w:ind w:leftChars="100" w:left="320"/>
-        <w:rPr>
-          <w:rFonts w:ascii="Times New Roman" w:eastAsia="TimesNewRomanPS-BoldMT" w:hAnsi="Times New Roman"/>
-          <w:b/>
-          <w:bCs/>
-          <w:sz w:val="26"/>
-          <w:szCs w:val="26"/>
-          <w:lang w:eastAsia="zh-CN" w:bidi="ar"/>
-        </w:rPr>
-      </w:pPr>
-      <w:r>
-        <w:rPr>
-          <w:rFonts w:ascii="Times New Roman" w:eastAsia="TimesNewRomanPS-BoldMT" w:hAnsi="Times New Roman"/>
-          <w:b/>
-          <w:bCs/>
-          <w:sz w:val="26"/>
-          <w:szCs w:val="26"/>
-          <w:lang w:eastAsia="zh-CN" w:bidi="ar"/>
-        </w:rPr>
-        <w:t xml:space="preserve">2.1 Các dịch vụ </w:t>
-      </w:r>
-      <w:r>
-        <w:rPr>
-          <w:rFonts w:ascii="Times New Roman" w:eastAsia="TimesNewRomanPS-BoldMT" w:hAnsi="Times New Roman"/>
-          <w:b/>
-          <w:bCs/>
-          <w:sz w:val="26"/>
-          <w:szCs w:val="26"/>
-          <w:lang w:eastAsia="zh-CN" w:bidi="ar"/>
-        </w:rPr>
-        <w:t>ưu đãi/tặng kèm</w:t>
-      </w:r>
-      <w:r>
-        <w:rPr>
-          <w:rFonts w:ascii="Times New Roman" w:eastAsia="TimesNewRomanPS-BoldMT" w:hAnsi="Times New Roman"/>
-          <w:b/>
-          <w:bCs/>
-          <w:sz w:val="26"/>
-          <w:szCs w:val="26"/>
-          <w:lang w:eastAsia="zh-CN" w:bidi="ar"/>
-        </w:rPr>
-        <w:t xml:space="preserve"> bao gồm: </w:t>
-      </w:r>
-    </w:p>
-    <w:p>
-      <w:pPr>
-        <w:shd w:val="clear" w:color="auto" w:fill="FFFFFF" w:themeFill="background1"/>
-        <w:spacing w:line="360" w:lineRule="auto"/>
-        <w:ind w:leftChars="100" w:left="320"/>
-        <w:rPr>
-          <w:rFonts w:ascii="Times New Roman" w:hAnsi="Times New Roman"/>
-          <w:sz w:val="26"/>
-          <w:szCs w:val="26"/>
-        </w:rPr>
-      </w:pPr>
-      <w:r>
-        <w:rPr>
           <w:rFonts w:ascii="Times New Roman" w:hAnsi="Times New Roman"/>
           <w:sz w:val="26"/>
           <w:szCs w:val="26"/>
@@ -1468,33 +1209,23 @@
         </w:rPr>
       </w:pPr>
       <w:r>
+        <w:t>+ Kích thước sảnh: {Tiec_SanhTiec}</w:t>
+      </w:r>
+    </w:p>
+    <w:p>
+      <w:pPr>
+        <w:shd w:val="clear" w:color="auto" w:fill="FFFFFF" w:themeFill="background1"/>
+        <w:spacing w:line="360" w:lineRule="auto"/>
+        <w:ind w:left="1080"/>
         <w:rPr>
           <w:rFonts w:ascii="Times New Roman" w:hAnsi="Times New Roman"/>
           <w:i/>
           <w:sz w:val="26"/>
           <w:szCs w:val="26"/>
         </w:rPr>
-        <w:t xml:space="preserve">+ Kích thước sảnh </w:t>
-      </w:r>
-      <w:r>
-        <w:rPr>
-          <w:rFonts w:ascii="Times New Roman" w:hAnsi="Times New Roman"/>
-          <w:b/>
-          <w:bCs/>
-          <w:i/>
-          <w:sz w:val="26"/>
-          <w:szCs w:val="26"/>
-        </w:rPr>
-        <w:t>Lux ABCD</w:t>
-      </w:r>
-      <w:r>
-        <w:rPr>
-          <w:rFonts w:ascii="Times New Roman" w:hAnsi="Times New Roman"/>
-          <w:i/>
-          <w:sz w:val="26"/>
-          <w:szCs w:val="26"/>
-        </w:rPr>
-        <w:t>: 25m*49m*5m</w:t>
+      </w:pPr>
+      <w:r>
+        <w:t>+ Kích thước sân khấu {Tiec_SanhTiec}: {KichThuocSanKhau}</w:t>
       </w:r>
     </w:p>
     <w:p>
@@ -1504,78 +1235,12 @@
         <w:ind w:left="1080"/>
         <w:rPr>
           <w:rFonts w:ascii="Times New Roman" w:hAnsi="Times New Roman"/>
-          <w:i/>
-          <w:sz w:val="26"/>
-          <w:szCs w:val="26"/>
-        </w:rPr>
-      </w:pPr>
-      <w:r>
-        <w:rPr>
-          <w:rFonts w:ascii="Times New Roman" w:hAnsi="Times New Roman"/>
-          <w:i/>
-          <w:sz w:val="26"/>
-          <w:szCs w:val="26"/>
-        </w:rPr>
-        <w:t xml:space="preserve">+ Kích thước sân khấu </w:t>
-      </w:r>
-      <w:r>
-        <w:rPr>
-          <w:rFonts w:ascii="Times New Roman" w:hAnsi="Times New Roman"/>
-          <w:b/>
-          <w:bCs/>
-          <w:i/>
-          <w:sz w:val="26"/>
-          <w:szCs w:val="26"/>
-        </w:rPr>
-        <w:t xml:space="preserve">Lux ABCD: </w:t>
-      </w:r>
-      <w:r>
-        <w:rPr>
-          <w:rFonts w:ascii="Times New Roman" w:hAnsi="Times New Roman"/>
-          <w:i/>
-          <w:sz w:val="26"/>
-          <w:szCs w:val="26"/>
-        </w:rPr>
-        <w:t>12m*3.6m*0.8m</w:t>
-      </w:r>
-    </w:p>
-    <w:p>
-      <w:pPr>
-        <w:shd w:val="clear" w:color="auto" w:fill="FFFFFF" w:themeFill="background1"/>
-        <w:spacing w:line="360" w:lineRule="auto"/>
-        <w:ind w:left="1080"/>
-        <w:rPr>
-          <w:rFonts w:ascii="Times New Roman" w:hAnsi="Times New Roman"/>
-          <w:sz w:val="26"/>
-          <w:szCs w:val="26"/>
-        </w:rPr>
-      </w:pPr>
-      <w:r>
-        <w:rPr>
-          <w:rFonts w:ascii="Times New Roman" w:hAnsi="Times New Roman"/>
-          <w:i/>
-          <w:sz w:val="26"/>
-          <w:szCs w:val="26"/>
-        </w:rPr>
-        <w:t xml:space="preserve">+ Sức chứa tối đa là </w:t>
-      </w:r>
-      <w:r>
-        <w:rPr>
-          <w:rFonts w:ascii="Times New Roman" w:hAnsi="Times New Roman"/>
-          <w:i/>
-          <w:iCs/>
-          <w:sz w:val="26"/>
-          <w:szCs w:val="26"/>
-        </w:rPr>
-        <w:t>900 khách, tối thiểu nhận 500 khách</w:t>
-      </w:r>
-      <w:r>
-        <w:rPr>
-          <w:rFonts w:ascii="Times New Roman" w:hAnsi="Times New Roman"/>
-          <w:sz w:val="26"/>
-          <w:szCs w:val="26"/>
-        </w:rPr>
-        <w:t xml:space="preserve"> </w:t>
+          <w:sz w:val="26"/>
+          <w:szCs w:val="26"/>
+        </w:rPr>
+      </w:pPr>
+      <w:r>
+        <w:t xml:space="preserve">+ Sức chứa tối đa là {Sanh_QuyMoMax} khách, tối thiểu nhận {SoKhachDiemDanh} khách </w:t>
       </w:r>
     </w:p>
     <w:p>
@@ -1619,36 +1284,7 @@
         </w:rPr>
       </w:pPr>
       <w:r>
-        <w:rPr>
-          <w:rFonts w:ascii="Times New Roman" w:hAnsi="Times New Roman"/>
-          <w:i/>
-          <w:sz w:val="26"/>
-          <w:szCs w:val="26"/>
-          <w:lang w:eastAsia="zh-CN"/>
-        </w:rPr>
-        <w:t xml:space="preserve">+ Kích thươc sảnh </w:t>
-      </w:r>
-      <w:r>
-        <w:rPr>
-          <w:rFonts w:ascii="Times New Roman" w:hAnsi="Times New Roman"/>
-          <w:b/>
-          <w:bCs/>
-          <w:i/>
-          <w:sz w:val="26"/>
-          <w:szCs w:val="26"/>
-          <w:lang w:eastAsia="zh-CN"/>
-        </w:rPr>
-        <w:t xml:space="preserve">Lux E: </w:t>
-      </w:r>
-      <w:r>
-        <w:rPr>
-          <w:rFonts w:ascii="Times New Roman" w:hAnsi="Times New Roman"/>
-          <w:i/>
-          <w:sz w:val="26"/>
-          <w:szCs w:val="26"/>
-          <w:lang w:eastAsia="zh-CN"/>
-        </w:rPr>
-        <w:t>25m*25m*7.8m</w:t>
+        <w:t>+ Kích thước sảnh: {Tiec_SanhTiec}</w:t>
       </w:r>
     </w:p>
     <w:p>
@@ -2098,27 +1734,8 @@
             <w:tcW w:w="5135" w:type="dxa"/>
           </w:tcPr>
           <w:p>
-            <w:pPr>
-              <w:shd w:val="clear" w:color="auto" w:fill="FFFFFF" w:themeFill="background1"/>
-              <w:spacing w:line="360" w:lineRule="auto"/>
-              <w:rPr>
-                <w:rFonts w:ascii="Times New Roman" w:eastAsia="TimesNewRomanPS-BoldMT" w:hAnsi="Times New Roman"/>
-                <w:b/>
-                <w:bCs/>
-                <w:sz w:val="26"/>
-                <w:szCs w:val="26"/>
-                <w:lang w:eastAsia="zh-CN" w:bidi="ar"/>
-              </w:rPr>
-            </w:pPr>
             <w:r>
-              <w:rPr>
-                <w:rFonts w:ascii="Times New Roman" w:eastAsia="SimSun" w:hAnsi="Times New Roman"/>
-                <w:sz w:val="26"/>
-                <w:szCs w:val="26"/>
-                <w:lang w:eastAsia="zh-CN" w:bidi="ar"/>
-              </w:rPr>
-              <w:lastRenderedPageBreak/>
-              <w:t>Phí setup sảnh Lux ABCD</w:t>
+              <w:t>Phí setup sảnh {Tiec_SanhTiec}</w:t>
             </w:r>
           </w:p>
         </w:tc>
@@ -2127,26 +1744,8 @@
             <w:tcW w:w="5001" w:type="dxa"/>
           </w:tcPr>
           <w:p>
-            <w:pPr>
-              <w:shd w:val="clear" w:color="auto" w:fill="FFFFFF" w:themeFill="background1"/>
-              <w:spacing w:line="360" w:lineRule="auto"/>
-              <w:rPr>
-                <w:rFonts w:ascii="Times New Roman" w:eastAsia="TimesNewRomanPS-BoldMT" w:hAnsi="Times New Roman"/>
-                <w:b/>
-                <w:bCs/>
-                <w:sz w:val="26"/>
-                <w:szCs w:val="26"/>
-                <w:lang w:eastAsia="zh-CN" w:bidi="ar"/>
-              </w:rPr>
-            </w:pPr>
             <w:r>
-              <w:rPr>
-                <w:rFonts w:ascii="Times New Roman" w:eastAsia="SimSun" w:hAnsi="Times New Roman"/>
-                <w:sz w:val="26"/>
-                <w:szCs w:val="26"/>
-                <w:lang w:eastAsia="zh-CN" w:bidi="ar"/>
-              </w:rPr>
-              <w:t>45.000.000VNĐ++/ ngày/ sảnh* …. ngày</w:t>
+              <w:t>{Gia_PhiSetupSanh}VNĐ++/ ngày/ sảnh* {SoNgay} ngày</w:t>
             </w:r>
           </w:p>
         </w:tc>
@@ -2157,24 +1756,8 @@
             <w:tcW w:w="5135" w:type="dxa"/>
           </w:tcPr>
           <w:p>
-            <w:pPr>
-              <w:shd w:val="clear" w:color="auto" w:fill="FFFFFF" w:themeFill="background1"/>
-              <w:spacing w:line="360" w:lineRule="auto"/>
-              <w:rPr>
-                <w:rFonts w:ascii="Times New Roman" w:eastAsia="SimSun" w:hAnsi="Times New Roman"/>
-                <w:sz w:val="26"/>
-                <w:szCs w:val="26"/>
-                <w:lang w:eastAsia="zh-CN" w:bidi="ar"/>
-              </w:rPr>
-            </w:pPr>
             <w:r>
-              <w:rPr>
-                <w:rFonts w:ascii="Times New Roman" w:eastAsia="SimSun" w:hAnsi="Times New Roman"/>
-                <w:sz w:val="26"/>
-                <w:szCs w:val="26"/>
-                <w:lang w:eastAsia="zh-CN" w:bidi="ar"/>
-              </w:rPr>
-              <w:t>Phí thuê sảnh Lux ABCD</w:t>
+              <w:t>Phí thuê sảnh {Tiec_SanhTiec}</w:t>
             </w:r>
           </w:p>
         </w:tc>
@@ -2183,24 +1766,8 @@
             <w:tcW w:w="5001" w:type="dxa"/>
           </w:tcPr>
           <w:p>
-            <w:pPr>
-              <w:shd w:val="clear" w:color="auto" w:fill="FFFFFF" w:themeFill="background1"/>
-              <w:spacing w:line="360" w:lineRule="auto"/>
-              <w:rPr>
-                <w:rFonts w:ascii="Times New Roman" w:eastAsia="SimSun" w:hAnsi="Times New Roman"/>
-                <w:sz w:val="26"/>
-                <w:szCs w:val="26"/>
-                <w:lang w:eastAsia="zh-CN" w:bidi="ar"/>
-              </w:rPr>
-            </w:pPr>
             <w:r>
-              <w:rPr>
-                <w:rFonts w:ascii="Times New Roman" w:eastAsia="SimSun" w:hAnsi="Times New Roman"/>
-                <w:sz w:val="26"/>
-                <w:szCs w:val="26"/>
-                <w:lang w:eastAsia="zh-CN" w:bidi="ar"/>
-              </w:rPr>
-              <w:t>140.000.000VNĐ++/ ngày/ sảnh * …. ngày</w:t>
+              <w:t>{Gia_PhiThueSanh}VNĐ++/ ngày/ sảnh * {SoNgay} ngày</w:t>
             </w:r>
           </w:p>
         </w:tc>
@@ -2237,24 +1804,8 @@
             <w:tcW w:w="5001" w:type="dxa"/>
           </w:tcPr>
           <w:p>
-            <w:pPr>
-              <w:shd w:val="clear" w:color="auto" w:fill="FFFFFF" w:themeFill="background1"/>
-              <w:spacing w:line="360" w:lineRule="auto"/>
-              <w:rPr>
-                <w:rFonts w:ascii="Times New Roman" w:eastAsia="SimSun" w:hAnsi="Times New Roman"/>
-                <w:sz w:val="26"/>
-                <w:szCs w:val="26"/>
-                <w:lang w:eastAsia="zh-CN" w:bidi="ar"/>
-              </w:rPr>
-            </w:pPr>
             <w:r>
-              <w:rPr>
-                <w:rFonts w:ascii="Times New Roman" w:eastAsia="SimSun" w:hAnsi="Times New Roman"/>
-                <w:sz w:val="26"/>
-                <w:szCs w:val="26"/>
-                <w:lang w:eastAsia="zh-CN" w:bidi="ar"/>
-              </w:rPr>
-              <w:t xml:space="preserve">15.000.000VNĐ++/sảnh/show </w:t>
+              <w:t xml:space="preserve">{Gia_PhiAmThanh}VNĐ++/sảnh/show </w:t>
             </w:r>
           </w:p>
         </w:tc>
@@ -2265,24 +1816,8 @@
             <w:tcW w:w="5135" w:type="dxa"/>
           </w:tcPr>
           <w:p>
-            <w:pPr>
-              <w:shd w:val="clear" w:color="auto" w:fill="FFFFFF" w:themeFill="background1"/>
-              <w:spacing w:line="360" w:lineRule="auto"/>
-              <w:rPr>
-                <w:rFonts w:ascii="Times New Roman" w:eastAsia="SimSun" w:hAnsi="Times New Roman"/>
-                <w:sz w:val="26"/>
-                <w:szCs w:val="26"/>
-                <w:lang w:eastAsia="zh-CN" w:bidi="ar"/>
-              </w:rPr>
-            </w:pPr>
             <w:r>
-              <w:rPr>
-                <w:rFonts w:ascii="Times New Roman" w:eastAsia="SimSun" w:hAnsi="Times New Roman"/>
-                <w:sz w:val="26"/>
-                <w:szCs w:val="26"/>
-                <w:lang w:eastAsia="zh-CN" w:bidi="ar"/>
-              </w:rPr>
-              <w:t>Công căng backdrop trước sảnh 3m*5m</w:t>
+              <w:t>Công căng backdrop trước sảnh {KichThuocBackdrop}</w:t>
             </w:r>
           </w:p>
         </w:tc>
@@ -2291,24 +1826,8 @@
             <w:tcW w:w="5001" w:type="dxa"/>
           </w:tcPr>
           <w:p>
-            <w:pPr>
-              <w:shd w:val="clear" w:color="auto" w:fill="FFFFFF" w:themeFill="background1"/>
-              <w:spacing w:line="360" w:lineRule="auto"/>
-              <w:rPr>
-                <w:rFonts w:ascii="Times New Roman" w:eastAsia="SimSun" w:hAnsi="Times New Roman"/>
-                <w:sz w:val="26"/>
-                <w:szCs w:val="26"/>
-                <w:lang w:eastAsia="zh-CN" w:bidi="ar"/>
-              </w:rPr>
-            </w:pPr>
             <w:r>
-              <w:rPr>
-                <w:rFonts w:ascii="Times New Roman" w:eastAsia="SimSun" w:hAnsi="Times New Roman"/>
-                <w:sz w:val="26"/>
-                <w:szCs w:val="26"/>
-                <w:lang w:eastAsia="zh-CN" w:bidi="ar"/>
-              </w:rPr>
-              <w:t>1.000.000VNĐ++/tấm</w:t>
+              <w:t>{Gia_PhiCangBackdrop}VNĐ++/tấm</w:t>
             </w:r>
           </w:p>
         </w:tc>
@@ -2319,44 +1838,9 @@
             <w:tcW w:w="5135" w:type="dxa"/>
           </w:tcPr>
           <w:p>
-            <w:pPr>
-              <w:shd w:val="clear" w:color="auto" w:fill="FFFFFF" w:themeFill="background1"/>
-              <w:spacing w:line="360" w:lineRule="auto"/>
-              <w:rPr>
-                <w:rFonts w:ascii="Times New Roman" w:eastAsia="SimSun" w:hAnsi="Times New Roman"/>
-                <w:sz w:val="26"/>
-                <w:szCs w:val="26"/>
-                <w:lang w:eastAsia="zh-CN" w:bidi="ar"/>
-              </w:rPr>
-            </w:pPr>
             <w:r>
-              <w:rPr>
-                <w:rFonts w:ascii="Times New Roman" w:eastAsia="SimSun" w:hAnsi="Times New Roman"/>
-                <w:sz w:val="26"/>
-                <w:szCs w:val="26"/>
-                <w:lang w:eastAsia="zh-CN" w:bidi="ar"/>
-              </w:rPr>
-              <w:t>Màn hình Led trong tiệc 12m2</w:t>
-            </w:r>
-          </w:p>
-          <w:p>
-            <w:pPr>
-              <w:shd w:val="clear" w:color="auto" w:fill="FFFFFF" w:themeFill="background1"/>
-              <w:spacing w:line="360" w:lineRule="auto"/>
-              <w:rPr>
-                <w:rFonts w:ascii="Times New Roman" w:eastAsia="SimSun" w:hAnsi="Times New Roman"/>
-                <w:sz w:val="26"/>
-                <w:szCs w:val="26"/>
-                <w:lang w:eastAsia="zh-CN" w:bidi="ar"/>
-              </w:rPr>
-            </w:pPr>
-            <w:r>
-              <w:rPr>
-                <w:rFonts w:ascii="Times New Roman" w:eastAsia="SimSun" w:hAnsi="Times New Roman"/>
-                <w:sz w:val="26"/>
-                <w:szCs w:val="26"/>
-                <w:lang w:eastAsia="zh-CN" w:bidi="ar"/>
-              </w:rPr>
+              <w:t>Màn hình Led trong tiệc {KichThuocLed}</w:t>
+              <w:br/>
               <w:t>Thực đơn tiệc:</w:t>
             </w:r>
           </w:p>
@@ -2366,24 +1850,8 @@
             <w:tcW w:w="5001" w:type="dxa"/>
           </w:tcPr>
           <w:p>
-            <w:pPr>
-              <w:shd w:val="clear" w:color="auto" w:fill="FFFFFF" w:themeFill="background1"/>
-              <w:spacing w:line="360" w:lineRule="auto"/>
-              <w:rPr>
-                <w:rFonts w:ascii="Times New Roman" w:eastAsia="SimSun" w:hAnsi="Times New Roman"/>
-                <w:sz w:val="26"/>
-                <w:szCs w:val="26"/>
-                <w:lang w:eastAsia="zh-CN" w:bidi="ar"/>
-              </w:rPr>
-            </w:pPr>
             <w:r>
-              <w:rPr>
-                <w:rFonts w:ascii="Times New Roman" w:eastAsia="SimSun" w:hAnsi="Times New Roman"/>
-                <w:sz w:val="26"/>
-                <w:szCs w:val="26"/>
-                <w:lang w:eastAsia="zh-CN" w:bidi="ar"/>
-              </w:rPr>
-              <w:t>5.000.000VNĐ++/show</w:t>
+              <w:t>{Gia_PhiManHinhLed}VNĐ++/show</w:t>
             </w:r>
           </w:p>
         </w:tc>
@@ -2426,26 +1894,8 @@
             <w:shd w:val="clear" w:color="auto" w:fill="FFFFFF" w:themeFill="background1"/>
           </w:tcPr>
           <w:p>
-            <w:pPr>
-              <w:pStyle w:val="TableParagraph"/>
-              <w:shd w:val="clear" w:color="auto" w:fill="FFFFFF" w:themeFill="background1"/>
-              <w:spacing w:before="181"/>
-              <w:ind w:left="107"/>
-              <w:jc w:val="center"/>
-              <w:rPr>
-                <w:b/>
-                <w:sz w:val="26"/>
-                <w:szCs w:val="26"/>
-              </w:rPr>
-            </w:pPr>
             <w:r>
-              <w:rPr>
-                <w:b/>
-                <w:spacing w:val="-5"/>
-                <w:sz w:val="26"/>
-                <w:szCs w:val="26"/>
-              </w:rPr>
-              <w:t>STT</w:t>
+              <w:t>{#MenuTiec}{STT}</w:t>
             </w:r>
           </w:p>
         </w:tc>
@@ -2456,60 +1906,8 @@
             <w:shd w:val="clear" w:color="auto" w:fill="FFFFFF" w:themeFill="background1"/>
           </w:tcPr>
           <w:p>
-            <w:pPr>
-              <w:pStyle w:val="TableParagraph"/>
-              <w:shd w:val="clear" w:color="auto" w:fill="FFFFFF" w:themeFill="background1"/>
-              <w:spacing w:before="181"/>
-              <w:ind w:left="9"/>
-              <w:jc w:val="center"/>
-              <w:rPr>
-                <w:b/>
-                <w:sz w:val="26"/>
-                <w:szCs w:val="26"/>
-              </w:rPr>
-            </w:pPr>
             <w:r>
-              <w:rPr>
-                <w:b/>
-                <w:sz w:val="26"/>
-                <w:szCs w:val="26"/>
-              </w:rPr>
-              <w:t>Thực</w:t>
-            </w:r>
-            <w:r>
-              <w:rPr>
-                <w:b/>
-                <w:spacing w:val="-2"/>
-                <w:sz w:val="26"/>
-                <w:szCs w:val="26"/>
-              </w:rPr>
-              <w:t xml:space="preserve"> </w:t>
-            </w:r>
-            <w:r>
-              <w:rPr>
-                <w:b/>
-                <w:sz w:val="26"/>
-                <w:szCs w:val="26"/>
-              </w:rPr>
-              <w:t>đơn</w:t>
-            </w:r>
-            <w:r>
-              <w:rPr>
-                <w:b/>
-                <w:spacing w:val="1"/>
-                <w:sz w:val="26"/>
-                <w:szCs w:val="26"/>
-              </w:rPr>
-              <w:t xml:space="preserve"> </w:t>
-            </w:r>
-            <w:r>
-              <w:rPr>
-                <w:b/>
-                <w:spacing w:val="-5"/>
-                <w:sz w:val="26"/>
-                <w:szCs w:val="26"/>
-              </w:rPr>
-              <w:t>mặn</w:t>
+              <w:t>{TenMon}</w:t>
             </w:r>
           </w:p>
         </w:tc>
@@ -2613,533 +2011,12 @@
             <w:shd w:val="clear" w:color="auto" w:fill="FFFFFF" w:themeFill="background1"/>
           </w:tcPr>
           <w:p>
-            <w:pPr>
-              <w:pStyle w:val="TableParagraph"/>
-              <w:shd w:val="clear" w:color="auto" w:fill="FFFFFF" w:themeFill="background1"/>
-              <w:spacing w:before="18"/>
-              <w:ind w:left="7"/>
-              <w:jc w:val="center"/>
-              <w:rPr>
-                <w:b/>
-                <w:sz w:val="26"/>
-                <w:szCs w:val="26"/>
-                <w:lang w:val="en-US"/>
-              </w:rPr>
-            </w:pPr>
             <w:r>
-              <w:rPr>
-                <w:b/>
-                <w:spacing w:val="-5"/>
-                <w:sz w:val="26"/>
-                <w:szCs w:val="26"/>
-                <w:lang w:val="en-US"/>
-              </w:rPr>
-              <w:t>VNĐ</w:t>
+              <w:t>{/MenuTiec}</w:t>
             </w:r>
           </w:p>
         </w:tc>
       </w:tr>
-      <w:tr>
-        <w:trPr>
-          <w:trHeight w:val="457"/>
-          <w:jc w:val="center"/>
-        </w:trPr>
-        <w:tc>
-          <w:tcPr>
-            <w:tcW w:w="630" w:type="dxa"/>
-            <w:shd w:val="clear" w:color="auto" w:fill="FFFFFF" w:themeFill="background1"/>
-          </w:tcPr>
-          <w:p>
-            <w:pPr>
-              <w:pStyle w:val="TableParagraph"/>
-              <w:shd w:val="clear" w:color="auto" w:fill="FFFFFF" w:themeFill="background1"/>
-              <w:spacing w:before="83"/>
-              <w:ind w:left="9"/>
-              <w:jc w:val="center"/>
-              <w:rPr>
-                <w:sz w:val="26"/>
-                <w:szCs w:val="26"/>
-              </w:rPr>
-            </w:pPr>
-            <w:r>
-              <w:rPr>
-                <w:spacing w:val="-10"/>
-                <w:sz w:val="26"/>
-                <w:szCs w:val="26"/>
-              </w:rPr>
-              <w:t>1</w:t>
-            </w:r>
-          </w:p>
-        </w:tc>
-        <w:tc>
-          <w:tcPr>
-            <w:tcW w:w="6120" w:type="dxa"/>
-            <w:shd w:val="clear" w:color="auto" w:fill="FFFFFF" w:themeFill="background1"/>
-            <w:vAlign w:val="center"/>
-          </w:tcPr>
-          <w:p>
-            <w:pPr>
-              <w:pStyle w:val="TableParagraph"/>
-              <w:shd w:val="clear" w:color="auto" w:fill="FFFFFF" w:themeFill="background1"/>
-              <w:rPr>
-                <w:sz w:val="26"/>
-                <w:szCs w:val="26"/>
-              </w:rPr>
-            </w:pPr>
-          </w:p>
-        </w:tc>
-        <w:tc>
-          <w:tcPr>
-            <w:tcW w:w="3330" w:type="dxa"/>
-            <w:shd w:val="clear" w:color="auto" w:fill="FFFFFF" w:themeFill="background1"/>
-            <w:vAlign w:val="center"/>
-          </w:tcPr>
-          <w:p>
-            <w:pPr>
-              <w:pStyle w:val="TableParagraph"/>
-              <w:shd w:val="clear" w:color="auto" w:fill="FFFFFF" w:themeFill="background1"/>
-              <w:jc w:val="right"/>
-              <w:rPr>
-                <w:sz w:val="26"/>
-                <w:szCs w:val="26"/>
-              </w:rPr>
-            </w:pPr>
-          </w:p>
-        </w:tc>
-      </w:tr>
-      <w:tr>
-        <w:trPr>
-          <w:trHeight w:val="422"/>
-          <w:jc w:val="center"/>
-        </w:trPr>
-        <w:tc>
-          <w:tcPr>
-            <w:tcW w:w="630" w:type="dxa"/>
-            <w:shd w:val="clear" w:color="auto" w:fill="FFFFFF" w:themeFill="background1"/>
-          </w:tcPr>
-          <w:p>
-            <w:pPr>
-              <w:pStyle w:val="TableParagraph"/>
-              <w:shd w:val="clear" w:color="auto" w:fill="FFFFFF" w:themeFill="background1"/>
-              <w:spacing w:before="66"/>
-              <w:ind w:left="9"/>
-              <w:jc w:val="center"/>
-              <w:rPr>
-                <w:sz w:val="26"/>
-                <w:szCs w:val="26"/>
-              </w:rPr>
-            </w:pPr>
-            <w:r>
-              <w:rPr>
-                <w:spacing w:val="-10"/>
-                <w:sz w:val="26"/>
-                <w:szCs w:val="26"/>
-              </w:rPr>
-              <w:t>2</w:t>
-            </w:r>
-          </w:p>
-        </w:tc>
-        <w:tc>
-          <w:tcPr>
-            <w:tcW w:w="6120" w:type="dxa"/>
-            <w:shd w:val="clear" w:color="auto" w:fill="FFFFFF" w:themeFill="background1"/>
-            <w:vAlign w:val="center"/>
-          </w:tcPr>
-          <w:p>
-            <w:pPr>
-              <w:pStyle w:val="TableParagraph"/>
-              <w:shd w:val="clear" w:color="auto" w:fill="FFFFFF" w:themeFill="background1"/>
-              <w:rPr>
-                <w:sz w:val="26"/>
-                <w:szCs w:val="26"/>
-              </w:rPr>
-            </w:pPr>
-          </w:p>
-        </w:tc>
-        <w:tc>
-          <w:tcPr>
-            <w:tcW w:w="3330" w:type="dxa"/>
-            <w:shd w:val="clear" w:color="auto" w:fill="FFFFFF" w:themeFill="background1"/>
-            <w:vAlign w:val="center"/>
-          </w:tcPr>
-          <w:p>
-            <w:pPr>
-              <w:pStyle w:val="TableParagraph"/>
-              <w:shd w:val="clear" w:color="auto" w:fill="FFFFFF" w:themeFill="background1"/>
-              <w:jc w:val="right"/>
-              <w:rPr>
-                <w:sz w:val="26"/>
-                <w:szCs w:val="26"/>
-              </w:rPr>
-            </w:pPr>
-          </w:p>
-        </w:tc>
-      </w:tr>
-      <w:tr>
-        <w:trPr>
-          <w:trHeight w:val="422"/>
-          <w:jc w:val="center"/>
-        </w:trPr>
-        <w:tc>
-          <w:tcPr>
-            <w:tcW w:w="630" w:type="dxa"/>
-            <w:shd w:val="clear" w:color="auto" w:fill="FFFFFF" w:themeFill="background1"/>
-          </w:tcPr>
-          <w:p>
-            <w:pPr>
-              <w:pStyle w:val="TableParagraph"/>
-              <w:shd w:val="clear" w:color="auto" w:fill="FFFFFF" w:themeFill="background1"/>
-              <w:spacing w:before="66"/>
-              <w:ind w:left="9"/>
-              <w:jc w:val="center"/>
-              <w:rPr>
-                <w:sz w:val="26"/>
-                <w:szCs w:val="26"/>
-              </w:rPr>
-            </w:pPr>
-            <w:r>
-              <w:rPr>
-                <w:spacing w:val="-10"/>
-                <w:sz w:val="26"/>
-                <w:szCs w:val="26"/>
-              </w:rPr>
-              <w:t>3</w:t>
-            </w:r>
-          </w:p>
-        </w:tc>
-        <w:tc>
-          <w:tcPr>
-            <w:tcW w:w="6120" w:type="dxa"/>
-            <w:shd w:val="clear" w:color="auto" w:fill="FFFFFF" w:themeFill="background1"/>
-            <w:vAlign w:val="center"/>
-          </w:tcPr>
-          <w:p>
-            <w:pPr>
-              <w:pStyle w:val="TableParagraph"/>
-              <w:shd w:val="clear" w:color="auto" w:fill="FFFFFF" w:themeFill="background1"/>
-              <w:rPr>
-                <w:sz w:val="26"/>
-                <w:szCs w:val="26"/>
-              </w:rPr>
-            </w:pPr>
-          </w:p>
-        </w:tc>
-        <w:tc>
-          <w:tcPr>
-            <w:tcW w:w="3330" w:type="dxa"/>
-            <w:shd w:val="clear" w:color="auto" w:fill="FFFFFF" w:themeFill="background1"/>
-            <w:vAlign w:val="center"/>
-          </w:tcPr>
-          <w:p>
-            <w:pPr>
-              <w:pStyle w:val="TableParagraph"/>
-              <w:shd w:val="clear" w:color="auto" w:fill="FFFFFF" w:themeFill="background1"/>
-              <w:jc w:val="right"/>
-              <w:rPr>
-                <w:sz w:val="26"/>
-                <w:szCs w:val="26"/>
-              </w:rPr>
-            </w:pPr>
-          </w:p>
-        </w:tc>
-      </w:tr>
-      <w:tr>
-        <w:trPr>
-          <w:trHeight w:val="422"/>
-          <w:jc w:val="center"/>
-        </w:trPr>
-        <w:tc>
-          <w:tcPr>
-            <w:tcW w:w="630" w:type="dxa"/>
-            <w:shd w:val="clear" w:color="auto" w:fill="FFFFFF" w:themeFill="background1"/>
-          </w:tcPr>
-          <w:p>
-            <w:pPr>
-              <w:pStyle w:val="TableParagraph"/>
-              <w:shd w:val="clear" w:color="auto" w:fill="FFFFFF" w:themeFill="background1"/>
-              <w:spacing w:before="66"/>
-              <w:ind w:left="9"/>
-              <w:jc w:val="center"/>
-              <w:rPr>
-                <w:sz w:val="26"/>
-                <w:szCs w:val="26"/>
-              </w:rPr>
-            </w:pPr>
-            <w:r>
-              <w:rPr>
-                <w:spacing w:val="-10"/>
-                <w:sz w:val="26"/>
-                <w:szCs w:val="26"/>
-              </w:rPr>
-              <w:t>4</w:t>
-            </w:r>
-          </w:p>
-        </w:tc>
-        <w:tc>
-          <w:tcPr>
-            <w:tcW w:w="6120" w:type="dxa"/>
-            <w:shd w:val="clear" w:color="auto" w:fill="FFFFFF" w:themeFill="background1"/>
-            <w:vAlign w:val="center"/>
-          </w:tcPr>
-          <w:p>
-            <w:pPr>
-              <w:pStyle w:val="TableParagraph"/>
-              <w:shd w:val="clear" w:color="auto" w:fill="FFFFFF" w:themeFill="background1"/>
-              <w:rPr>
-                <w:sz w:val="26"/>
-                <w:szCs w:val="26"/>
-              </w:rPr>
-            </w:pPr>
-          </w:p>
-        </w:tc>
-        <w:tc>
-          <w:tcPr>
-            <w:tcW w:w="3330" w:type="dxa"/>
-            <w:shd w:val="clear" w:color="auto" w:fill="FFFFFF" w:themeFill="background1"/>
-            <w:vAlign w:val="center"/>
-          </w:tcPr>
-          <w:p>
-            <w:pPr>
-              <w:pStyle w:val="TableParagraph"/>
-              <w:shd w:val="clear" w:color="auto" w:fill="FFFFFF" w:themeFill="background1"/>
-              <w:jc w:val="right"/>
-              <w:rPr>
-                <w:sz w:val="26"/>
-                <w:szCs w:val="26"/>
-              </w:rPr>
-            </w:pPr>
-          </w:p>
-        </w:tc>
-      </w:tr>
-      <w:tr>
-        <w:trPr>
-          <w:trHeight w:val="421"/>
-          <w:jc w:val="center"/>
-        </w:trPr>
-        <w:tc>
-          <w:tcPr>
-            <w:tcW w:w="630" w:type="dxa"/>
-            <w:shd w:val="clear" w:color="auto" w:fill="FFFFFF" w:themeFill="background1"/>
-          </w:tcPr>
-          <w:p>
-            <w:pPr>
-              <w:pStyle w:val="TableParagraph"/>
-              <w:shd w:val="clear" w:color="auto" w:fill="FFFFFF" w:themeFill="background1"/>
-              <w:spacing w:before="66"/>
-              <w:ind w:left="9"/>
-              <w:jc w:val="center"/>
-              <w:rPr>
-                <w:sz w:val="26"/>
-                <w:szCs w:val="26"/>
-              </w:rPr>
-            </w:pPr>
-            <w:r>
-              <w:rPr>
-                <w:spacing w:val="-10"/>
-                <w:sz w:val="26"/>
-                <w:szCs w:val="26"/>
-              </w:rPr>
-              <w:t>5</w:t>
-            </w:r>
-          </w:p>
-        </w:tc>
-        <w:tc>
-          <w:tcPr>
-            <w:tcW w:w="6120" w:type="dxa"/>
-            <w:shd w:val="clear" w:color="auto" w:fill="FFFFFF" w:themeFill="background1"/>
-            <w:vAlign w:val="center"/>
-          </w:tcPr>
-          <w:p>
-            <w:pPr>
-              <w:pStyle w:val="TableParagraph"/>
-              <w:shd w:val="clear" w:color="auto" w:fill="FFFFFF" w:themeFill="background1"/>
-              <w:rPr>
-                <w:sz w:val="26"/>
-                <w:szCs w:val="26"/>
-              </w:rPr>
-            </w:pPr>
-          </w:p>
-        </w:tc>
-        <w:tc>
-          <w:tcPr>
-            <w:tcW w:w="3330" w:type="dxa"/>
-            <w:shd w:val="clear" w:color="auto" w:fill="FFFFFF" w:themeFill="background1"/>
-            <w:vAlign w:val="center"/>
-          </w:tcPr>
-          <w:p>
-            <w:pPr>
-              <w:pStyle w:val="TableParagraph"/>
-              <w:shd w:val="clear" w:color="auto" w:fill="FFFFFF" w:themeFill="background1"/>
-              <w:jc w:val="right"/>
-              <w:rPr>
-                <w:sz w:val="26"/>
-                <w:szCs w:val="26"/>
-              </w:rPr>
-            </w:pPr>
-          </w:p>
-        </w:tc>
-      </w:tr>
-      <w:tr>
-        <w:trPr>
-          <w:trHeight w:val="421"/>
-          <w:jc w:val="center"/>
-        </w:trPr>
-        <w:tc>
-          <w:tcPr>
-            <w:tcW w:w="630" w:type="dxa"/>
-            <w:shd w:val="clear" w:color="auto" w:fill="FFFFFF" w:themeFill="background1"/>
-          </w:tcPr>
-          <w:p>
-            <w:pPr>
-              <w:pStyle w:val="TableParagraph"/>
-              <w:shd w:val="clear" w:color="auto" w:fill="FFFFFF" w:themeFill="background1"/>
-              <w:spacing w:before="66"/>
-              <w:ind w:left="9"/>
-              <w:jc w:val="center"/>
-              <w:rPr>
-                <w:spacing w:val="-10"/>
-                <w:sz w:val="26"/>
-                <w:szCs w:val="26"/>
-                <w:lang w:val="en-US"/>
-              </w:rPr>
-            </w:pPr>
-            <w:r>
-              <w:rPr>
-                <w:spacing w:val="-10"/>
-                <w:sz w:val="26"/>
-                <w:szCs w:val="26"/>
-                <w:lang w:val="en-US"/>
-              </w:rPr>
-              <w:t>6</w:t>
-            </w:r>
-          </w:p>
-        </w:tc>
-        <w:tc>
-          <w:tcPr>
-            <w:tcW w:w="6120" w:type="dxa"/>
-            <w:shd w:val="clear" w:color="auto" w:fill="FFFFFF" w:themeFill="background1"/>
-            <w:vAlign w:val="center"/>
-          </w:tcPr>
-          <w:p>
-            <w:pPr>
-              <w:pStyle w:val="TableParagraph"/>
-              <w:shd w:val="clear" w:color="auto" w:fill="FFFFFF" w:themeFill="background1"/>
-              <w:rPr>
-                <w:sz w:val="26"/>
-                <w:szCs w:val="26"/>
-              </w:rPr>
-            </w:pPr>
-          </w:p>
-        </w:tc>
-        <w:tc>
-          <w:tcPr>
-            <w:tcW w:w="3330" w:type="dxa"/>
-            <w:shd w:val="clear" w:color="auto" w:fill="FFFFFF" w:themeFill="background1"/>
-            <w:vAlign w:val="center"/>
-          </w:tcPr>
-          <w:p>
-            <w:pPr>
-              <w:pStyle w:val="TableParagraph"/>
-              <w:shd w:val="clear" w:color="auto" w:fill="FFFFFF" w:themeFill="background1"/>
-              <w:jc w:val="right"/>
-              <w:rPr>
-                <w:sz w:val="26"/>
-                <w:szCs w:val="26"/>
-              </w:rPr>
-            </w:pPr>
-          </w:p>
-        </w:tc>
-      </w:tr>
-      <w:tr>
-        <w:trPr>
-          <w:trHeight w:val="421"/>
-          <w:jc w:val="center"/>
-        </w:trPr>
-        <w:tc>
-          <w:tcPr>
-            <w:tcW w:w="630" w:type="dxa"/>
-            <w:shd w:val="clear" w:color="auto" w:fill="FFFFFF" w:themeFill="background1"/>
-          </w:tcPr>
-          <w:p>
-            <w:pPr>
-              <w:pStyle w:val="TableParagraph"/>
-              <w:shd w:val="clear" w:color="auto" w:fill="FFFFFF" w:themeFill="background1"/>
-              <w:jc w:val="both"/>
-              <w:rPr>
-                <w:sz w:val="26"/>
-                <w:szCs w:val="26"/>
-              </w:rPr>
-            </w:pPr>
-          </w:p>
-        </w:tc>
-        <w:tc>
-          <w:tcPr>
-            <w:tcW w:w="6120" w:type="dxa"/>
-            <w:shd w:val="clear" w:color="auto" w:fill="FFFFFF" w:themeFill="background1"/>
-          </w:tcPr>
-          <w:p>
-            <w:pPr>
-              <w:pStyle w:val="TableParagraph"/>
-              <w:shd w:val="clear" w:color="auto" w:fill="FFFFFF" w:themeFill="background1"/>
-              <w:spacing w:before="71"/>
-              <w:ind w:left="9"/>
-              <w:jc w:val="center"/>
-              <w:rPr>
-                <w:b/>
-                <w:sz w:val="26"/>
-                <w:szCs w:val="26"/>
-              </w:rPr>
-            </w:pPr>
-            <w:r>
-              <w:rPr>
-                <w:b/>
-                <w:sz w:val="26"/>
-                <w:szCs w:val="26"/>
-              </w:rPr>
-              <w:t>TỔNG</w:t>
-            </w:r>
-            <w:r>
-              <w:rPr>
-                <w:b/>
-                <w:spacing w:val="-2"/>
-                <w:sz w:val="26"/>
-                <w:szCs w:val="26"/>
-              </w:rPr>
-              <w:t xml:space="preserve"> </w:t>
-            </w:r>
-            <w:r>
-              <w:rPr>
-                <w:b/>
-                <w:spacing w:val="-4"/>
-                <w:sz w:val="26"/>
-                <w:szCs w:val="26"/>
-              </w:rPr>
-              <w:t>CỘNG</w:t>
-            </w:r>
-          </w:p>
-        </w:tc>
-        <w:tc>
-          <w:tcPr>
-            <w:tcW w:w="3330" w:type="dxa"/>
-            <w:shd w:val="clear" w:color="auto" w:fill="FFFFFF" w:themeFill="background1"/>
-            <w:vAlign w:val="center"/>
-          </w:tcPr>
-          <w:p>
-            <w:pPr>
-              <w:pStyle w:val="TableParagraph"/>
-              <w:shd w:val="clear" w:color="auto" w:fill="FFFFFF" w:themeFill="background1"/>
-              <w:jc w:val="center"/>
-              <w:rPr>
-                <w:b/>
-                <w:bCs/>
-                <w:sz w:val="26"/>
-                <w:szCs w:val="26"/>
-                <w:lang w:val="en-US"/>
-              </w:rPr>
-            </w:pPr>
-          </w:p>
-        </w:tc>
-      </w:tr>
     </w:tbl>
     <w:p>
       <w:pPr>
@@ -3167,25 +2044,7 @@
         </w:rPr>
       </w:pPr>
       <w:r>
-        <w:rPr>
-          <w:rFonts w:ascii="Times New Roman" w:hAnsi="Times New Roman"/>
-          <w:b/>
-          <w:i/>
-          <w:sz w:val="26"/>
-          <w:szCs w:val="26"/>
-        </w:rPr>
-        <w:t xml:space="preserve">Tất cả đơn giá trên chưa bao gồm 5% Phí phục vụ &amp; </w:t>
-      </w:r>
-      <w:r>
-        <w:rPr>
-          <w:rFonts w:ascii="Times New Roman" w:hAnsi="Times New Roman"/>
-          <w:b/>
-          <w:i/>
-          <w:sz w:val="26"/>
-          <w:szCs w:val="26"/>
-          <w:lang w:val="vi-VN"/>
-        </w:rPr>
-        <w:t>thuế GTGT theo quy định nhà nước</w:t>
+        <w:t>Tất cả đơn giá trên chưa bao gồm {MucPhiPhucVu}% Phí phục vụ &amp; thuế GTGT theo quy định nhà nước</w:t>
       </w:r>
     </w:p>
     <w:p>
@@ -3289,26 +2148,8 @@
             <w:tcW w:w="5001" w:type="dxa"/>
           </w:tcPr>
           <w:p>
-            <w:pPr>
-              <w:shd w:val="clear" w:color="auto" w:fill="FFFFFF" w:themeFill="background1"/>
-              <w:spacing w:line="360" w:lineRule="auto"/>
-              <w:rPr>
-                <w:rFonts w:ascii="Times New Roman" w:eastAsia="TimesNewRomanPS-BoldMT" w:hAnsi="Times New Roman"/>
-                <w:b/>
-                <w:bCs/>
-                <w:sz w:val="26"/>
-                <w:szCs w:val="26"/>
-                <w:lang w:eastAsia="zh-CN" w:bidi="ar"/>
-              </w:rPr>
-            </w:pPr>
             <w:r>
-              <w:rPr>
-                <w:rFonts w:ascii="Times New Roman" w:eastAsia="SimSun" w:hAnsi="Times New Roman"/>
-                <w:sz w:val="26"/>
-                <w:szCs w:val="26"/>
-                <w:lang w:eastAsia="zh-CN" w:bidi="ar"/>
-              </w:rPr>
-              <w:t xml:space="preserve">17.500.000VNĐ++/giờ/sảnh </w:t>
+              <w:t xml:space="preserve">{Gia_PhiThuePhatSinh}VNĐ++/giờ/sảnh </w:t>
             </w:r>
           </w:p>
         </w:tc>
@@ -3365,26 +2206,8 @@
             <w:tcW w:w="5001" w:type="dxa"/>
           </w:tcPr>
           <w:p>
-            <w:pPr>
-              <w:shd w:val="clear" w:color="auto" w:fill="FFFFFF" w:themeFill="background1"/>
-              <w:spacing w:line="360" w:lineRule="auto"/>
-              <w:rPr>
-                <w:rFonts w:ascii="Times New Roman" w:eastAsia="TimesNewRomanPS-BoldMT" w:hAnsi="Times New Roman"/>
-                <w:b/>
-                <w:bCs/>
-                <w:sz w:val="26"/>
-                <w:szCs w:val="26"/>
-                <w:lang w:eastAsia="zh-CN" w:bidi="ar"/>
-              </w:rPr>
-            </w:pPr>
             <w:r>
-              <w:rPr>
-                <w:rFonts w:ascii="Times New Roman" w:eastAsia="SimSun" w:hAnsi="Times New Roman"/>
-                <w:sz w:val="26"/>
-                <w:szCs w:val="26"/>
-                <w:lang w:eastAsia="zh-CN" w:bidi="ar"/>
-              </w:rPr>
-              <w:t xml:space="preserve">7.000.000VNĐ++/giờ/sảnh </w:t>
+              <w:t xml:space="preserve">{Gia_PhiMayLanh}VNĐ++/giờ/sảnh </w:t>
             </w:r>
           </w:p>
         </w:tc>
@@ -3430,24 +2253,8 @@
             <w:tcW w:w="5001" w:type="dxa"/>
           </w:tcPr>
           <w:p>
-            <w:pPr>
-              <w:shd w:val="clear" w:color="auto" w:fill="FFFFFF" w:themeFill="background1"/>
-              <w:spacing w:line="360" w:lineRule="auto"/>
-              <w:rPr>
-                <w:rFonts w:ascii="Times New Roman" w:eastAsia="SimSun" w:hAnsi="Times New Roman"/>
-                <w:sz w:val="26"/>
-                <w:szCs w:val="26"/>
-                <w:lang w:eastAsia="zh-CN" w:bidi="ar"/>
-              </w:rPr>
-            </w:pPr>
             <w:r>
-              <w:rPr>
-                <w:rFonts w:ascii="Times New Roman" w:eastAsia="SimSun" w:hAnsi="Times New Roman"/>
-                <w:sz w:val="26"/>
-                <w:szCs w:val="26"/>
-                <w:lang w:eastAsia="zh-CN" w:bidi="ar"/>
-              </w:rPr>
-              <w:t xml:space="preserve">300.000VNĐ++/cái </w:t>
+              <w:t xml:space="preserve">{Gia_PhiMicro}VNĐ++/cái </w:t>
             </w:r>
           </w:p>
         </w:tc>
@@ -3487,15 +2294,7 @@
         </w:rPr>
       </w:pPr>
       <w:r>
-        <w:rPr>
-          <w:rFonts w:ascii="Times New Roman" w:eastAsia="TimesNewRomanPS-BoldMT" w:hAnsi="Times New Roman"/>
-          <w:b/>
-          <w:bCs/>
-          <w:sz w:val="26"/>
-          <w:szCs w:val="26"/>
-          <w:lang w:eastAsia="zh-CN" w:bidi="ar"/>
-        </w:rPr>
-        <w:t xml:space="preserve">Tất cả giá trên chưa bao gồm 5% Phí phục vụ &amp; thuế GTGT theo quy định nhà nước </w:t>
+        <w:t xml:space="preserve">Tất cả giá trên chưa bao gồm {MucPhiPhucVu}% Phí phục vụ &amp; thuế GTGT theo quy định nhà nước </w:t>
       </w:r>
     </w:p>
     <w:p>
@@ -3903,43 +2702,6 @@
       </w:tr>
       <w:tr>
         <w:trPr>
-          <w:trHeight w:val="560"/>
-        </w:trPr>
-        <w:tc>
-          <w:tcPr>
-            <w:tcW w:w="10836" w:type="dxa"/>
-            <w:gridSpan w:val="8"/>
-            <w:vAlign w:val="center"/>
-          </w:tcPr>
-          <w:p>
-            <w:pPr>
-              <w:shd w:val="clear" w:color="auto" w:fill="FFFFFF" w:themeFill="background1"/>
-              <w:spacing w:line="312" w:lineRule="auto"/>
-              <w:ind w:leftChars="100" w:left="320"/>
-              <w:jc w:val="center"/>
-              <w:rPr>
-                <w:rFonts w:ascii="Times New Roman" w:hAnsi="Times New Roman"/>
-                <w:b/>
-                <w:bCs/>
-                <w:sz w:val="24"/>
-                <w:szCs w:val="24"/>
-              </w:rPr>
-            </w:pPr>
-            <w:r>
-              <w:rPr>
-                <w:rFonts w:ascii="Times New Roman" w:hAnsi="Times New Roman"/>
-                <w:b/>
-                <w:bCs/>
-                <w:sz w:val="24"/>
-                <w:szCs w:val="24"/>
-              </w:rPr>
-              <w:t>Ngày…..-Setup sảnh Lux ABCD</w:t>
-            </w:r>
-          </w:p>
-        </w:tc>
-      </w:tr>
-      <w:tr>
-        <w:trPr>
           <w:trHeight w:val="1057"/>
         </w:trPr>
         <w:tc>
@@ -3948,43 +2710,8 @@
             <w:vAlign w:val="center"/>
           </w:tcPr>
           <w:p>
-            <w:pPr>
-              <w:shd w:val="clear" w:color="auto" w:fill="FFFFFF" w:themeFill="background1"/>
-              <w:spacing w:line="312" w:lineRule="auto"/>
-              <w:ind w:leftChars="100" w:left="320"/>
-              <w:jc w:val="center"/>
-              <w:rPr>
-                <w:rFonts w:ascii="Times New Roman" w:hAnsi="Times New Roman"/>
-                <w:b/>
-                <w:bCs/>
-                <w:sz w:val="24"/>
-                <w:szCs w:val="24"/>
-              </w:rPr>
-            </w:pPr>
-          </w:p>
-          <w:p>
-            <w:pPr>
-              <w:shd w:val="clear" w:color="auto" w:fill="FFFFFF" w:themeFill="background1"/>
-              <w:spacing w:line="312" w:lineRule="auto"/>
-              <w:ind w:leftChars="100" w:left="320"/>
-              <w:jc w:val="center"/>
-              <w:rPr>
-                <w:rFonts w:ascii="Times New Roman" w:hAnsi="Times New Roman"/>
-                <w:b/>
-                <w:bCs/>
-                <w:sz w:val="24"/>
-                <w:szCs w:val="24"/>
-              </w:rPr>
-            </w:pPr>
             <w:r>
-              <w:rPr>
-                <w:rFonts w:ascii="Times New Roman" w:hAnsi="Times New Roman"/>
-                <w:b/>
-                <w:bCs/>
-                <w:sz w:val="24"/>
-                <w:szCs w:val="24"/>
-              </w:rPr>
-              <w:t>1.</w:t>
+              <w:t>{#DichVuBaoGia}{STT}</w:t>
             </w:r>
           </w:p>
         </w:tc>
@@ -3995,31 +2722,8 @@
             <w:vAlign w:val="center"/>
           </w:tcPr>
           <w:p>
-            <w:pPr>
-              <w:shd w:val="clear" w:color="auto" w:fill="FFFFFF" w:themeFill="background1"/>
-              <w:spacing w:line="312" w:lineRule="auto"/>
-              <w:rPr>
-                <w:rFonts w:ascii="Times New Roman" w:hAnsi="Times New Roman"/>
-                <w:sz w:val="24"/>
-                <w:szCs w:val="24"/>
-              </w:rPr>
-            </w:pPr>
             <w:r>
-              <w:rPr>
-                <w:rFonts w:ascii="Times New Roman" w:hAnsi="Times New Roman"/>
-                <w:sz w:val="24"/>
-                <w:szCs w:val="24"/>
-              </w:rPr>
-              <w:t xml:space="preserve">Phí setup sảnh Lux </w:t>
-            </w:r>
-            <w:r>
-              <w:rPr>
-                <w:rFonts w:ascii="Times New Roman" w:hAnsi="Times New Roman"/>
-                <w:sz w:val="24"/>
-                <w:szCs w:val="24"/>
-              </w:rPr>
-              <w:lastRenderedPageBreak/>
-              <w:t>ABCD</w:t>
+              <w:t>{TenDV}</w:t>
             </w:r>
           </w:p>
         </w:tc>
@@ -4029,24 +2733,8 @@
             <w:vAlign w:val="center"/>
           </w:tcPr>
           <w:p>
-            <w:pPr>
-              <w:shd w:val="clear" w:color="auto" w:fill="FFFFFF" w:themeFill="background1"/>
-              <w:spacing w:line="312" w:lineRule="auto"/>
-              <w:ind w:leftChars="100" w:left="320"/>
-              <w:rPr>
-                <w:rFonts w:ascii="Times New Roman" w:hAnsi="Times New Roman"/>
-                <w:sz w:val="24"/>
-                <w:szCs w:val="24"/>
-              </w:rPr>
-            </w:pPr>
             <w:r>
-              <w:rPr>
-                <w:rFonts w:ascii="Times New Roman" w:hAnsi="Times New Roman"/>
-                <w:sz w:val="24"/>
-                <w:szCs w:val="24"/>
-              </w:rPr>
-              <w:lastRenderedPageBreak/>
-              <w:t>08h00 - 18h00</w:t>
+              <w:t>{NoiDung}</w:t>
             </w:r>
           </w:p>
         </w:tc>
@@ -4056,23 +2744,8 @@
             <w:vAlign w:val="center"/>
           </w:tcPr>
           <w:p>
-            <w:pPr>
-              <w:shd w:val="clear" w:color="auto" w:fill="FFFFFF" w:themeFill="background1"/>
-              <w:spacing w:line="312" w:lineRule="auto"/>
-              <w:jc w:val="center"/>
-              <w:rPr>
-                <w:rFonts w:ascii="Times New Roman" w:hAnsi="Times New Roman"/>
-                <w:sz w:val="24"/>
-                <w:szCs w:val="24"/>
-              </w:rPr>
-            </w:pPr>
             <w:r>
-              <w:rPr>
-                <w:rFonts w:ascii="Times New Roman" w:hAnsi="Times New Roman"/>
-                <w:sz w:val="24"/>
-                <w:szCs w:val="24"/>
-              </w:rPr>
-              <w:t xml:space="preserve"> ngày</w:t>
+              <w:t>{DVT}</w:t>
             </w:r>
           </w:p>
         </w:tc>
@@ -4082,23 +2755,8 @@
             <w:vAlign w:val="center"/>
           </w:tcPr>
           <w:p>
-            <w:pPr>
-              <w:shd w:val="clear" w:color="auto" w:fill="FFFFFF" w:themeFill="background1"/>
-              <w:spacing w:line="312" w:lineRule="auto"/>
-              <w:ind w:leftChars="100" w:left="320"/>
-              <w:rPr>
-                <w:rFonts w:ascii="Times New Roman" w:hAnsi="Times New Roman"/>
-                <w:sz w:val="24"/>
-                <w:szCs w:val="24"/>
-              </w:rPr>
-            </w:pPr>
             <w:r>
-              <w:rPr>
-                <w:rFonts w:ascii="Times New Roman" w:hAnsi="Times New Roman"/>
-                <w:sz w:val="24"/>
-                <w:szCs w:val="24"/>
-              </w:rPr>
-              <w:t>1</w:t>
+              <w:t>{SL}</w:t>
             </w:r>
           </w:p>
         </w:tc>
@@ -4108,16 +2766,9 @@
             <w:vAlign w:val="center"/>
           </w:tcPr>
           <w:p>
-            <w:pPr>
-              <w:shd w:val="clear" w:color="auto" w:fill="FFFFFF" w:themeFill="background1"/>
-              <w:spacing w:line="312" w:lineRule="auto"/>
-              <w:ind w:leftChars="100" w:left="320"/>
-              <w:rPr>
-                <w:rFonts w:ascii="Times New Roman" w:hAnsi="Times New Roman"/>
-                <w:sz w:val="24"/>
-                <w:szCs w:val="24"/>
-              </w:rPr>
-            </w:pPr>
+            <w:r>
+              <w:t>{DonGia}</w:t>
+            </w:r>
           </w:p>
         </w:tc>
         <w:tc>
@@ -4126,16 +2777,9 @@
             <w:vAlign w:val="center"/>
           </w:tcPr>
           <w:p>
-            <w:pPr>
-              <w:shd w:val="clear" w:color="auto" w:fill="FFFFFF" w:themeFill="background1"/>
-              <w:spacing w:line="312" w:lineRule="auto"/>
-              <w:ind w:leftChars="100" w:left="320"/>
-              <w:rPr>
-                <w:rFonts w:ascii="Times New Roman" w:hAnsi="Times New Roman"/>
-                <w:sz w:val="24"/>
-                <w:szCs w:val="24"/>
-              </w:rPr>
-            </w:pPr>
+            <w:r>
+              <w:t>{UuDai}</w:t>
+            </w:r>
           </w:p>
         </w:tc>
         <w:tc>
@@ -4144,1252 +2788,9 @@
             <w:vAlign w:val="center"/>
           </w:tcPr>
           <w:p>
-            <w:pPr>
-              <w:shd w:val="clear" w:color="auto" w:fill="FFFFFF" w:themeFill="background1"/>
-              <w:spacing w:line="312" w:lineRule="auto"/>
-              <w:ind w:leftChars="100" w:left="320"/>
-              <w:rPr>
-                <w:rFonts w:ascii="Times New Roman" w:hAnsi="Times New Roman"/>
-                <w:sz w:val="24"/>
-                <w:szCs w:val="24"/>
-              </w:rPr>
-            </w:pPr>
-          </w:p>
-        </w:tc>
-      </w:tr>
-      <w:tr>
-        <w:trPr>
-          <w:trHeight w:val="1057"/>
-        </w:trPr>
-        <w:tc>
-          <w:tcPr>
-            <w:tcW w:w="1124" w:type="dxa"/>
-            <w:vAlign w:val="center"/>
-          </w:tcPr>
-          <w:p>
-            <w:pPr>
-              <w:shd w:val="clear" w:color="auto" w:fill="FFFFFF" w:themeFill="background1"/>
-              <w:spacing w:line="312" w:lineRule="auto"/>
-              <w:ind w:leftChars="100" w:left="320"/>
-              <w:jc w:val="center"/>
-              <w:rPr>
-                <w:rFonts w:ascii="Times New Roman" w:hAnsi="Times New Roman"/>
-                <w:b/>
-                <w:bCs/>
-                <w:sz w:val="24"/>
-                <w:szCs w:val="24"/>
-              </w:rPr>
-            </w:pPr>
             <w:r>
-              <w:rPr>
-                <w:rFonts w:ascii="Times New Roman" w:hAnsi="Times New Roman"/>
-                <w:b/>
-                <w:bCs/>
-                <w:sz w:val="24"/>
-                <w:szCs w:val="24"/>
-              </w:rPr>
-              <w:t>2.</w:t>
+              <w:t>{ThanhTien}{/DichVuBaoGia}</w:t>
             </w:r>
-          </w:p>
-        </w:tc>
-        <w:tc>
-          <w:tcPr>
-            <w:tcW w:w="1496" w:type="dxa"/>
-            <w:noWrap/>
-            <w:vAlign w:val="center"/>
-          </w:tcPr>
-          <w:p>
-            <w:pPr>
-              <w:shd w:val="clear" w:color="auto" w:fill="FFFFFF" w:themeFill="background1"/>
-              <w:spacing w:line="312" w:lineRule="auto"/>
-              <w:rPr>
-                <w:rFonts w:ascii="Times New Roman" w:hAnsi="Times New Roman"/>
-                <w:sz w:val="24"/>
-                <w:szCs w:val="24"/>
-              </w:rPr>
-            </w:pPr>
-            <w:r>
-              <w:rPr>
-                <w:rFonts w:ascii="Times New Roman" w:hAnsi="Times New Roman"/>
-                <w:sz w:val="24"/>
-                <w:szCs w:val="24"/>
-                <w:lang w:eastAsia="zh-CN"/>
-              </w:rPr>
-              <w:t>Phí đem âm thanh ánh sáng bên ngoài vào</w:t>
-            </w:r>
-          </w:p>
-        </w:tc>
-        <w:tc>
-          <w:tcPr>
-            <w:tcW w:w="1444" w:type="dxa"/>
-            <w:vAlign w:val="center"/>
-          </w:tcPr>
-          <w:p>
-            <w:pPr>
-              <w:shd w:val="clear" w:color="auto" w:fill="FFFFFF" w:themeFill="background1"/>
-              <w:spacing w:line="312" w:lineRule="auto"/>
-              <w:rPr>
-                <w:rFonts w:ascii="Times New Roman" w:hAnsi="Times New Roman"/>
-                <w:sz w:val="24"/>
-                <w:szCs w:val="24"/>
-              </w:rPr>
-            </w:pPr>
-            <w:r>
-              <w:rPr>
-                <w:rFonts w:ascii="Times New Roman" w:hAnsi="Times New Roman"/>
-                <w:sz w:val="24"/>
-                <w:szCs w:val="24"/>
-              </w:rPr>
-              <w:t>08h00 - 18h00</w:t>
-            </w:r>
-          </w:p>
-        </w:tc>
-        <w:tc>
-          <w:tcPr>
-            <w:tcW w:w="1008" w:type="dxa"/>
-            <w:vAlign w:val="center"/>
-          </w:tcPr>
-          <w:p>
-            <w:pPr>
-              <w:shd w:val="clear" w:color="auto" w:fill="FFFFFF" w:themeFill="background1"/>
-              <w:spacing w:line="312" w:lineRule="auto"/>
-              <w:jc w:val="center"/>
-              <w:rPr>
-                <w:rFonts w:ascii="Times New Roman" w:hAnsi="Times New Roman"/>
-                <w:sz w:val="24"/>
-                <w:szCs w:val="24"/>
-              </w:rPr>
-            </w:pPr>
-            <w:r>
-              <w:rPr>
-                <w:rFonts w:ascii="Times New Roman" w:hAnsi="Times New Roman"/>
-                <w:sz w:val="24"/>
-                <w:szCs w:val="24"/>
-              </w:rPr>
-              <w:t>Gói</w:t>
-            </w:r>
-          </w:p>
-        </w:tc>
-        <w:tc>
-          <w:tcPr>
-            <w:tcW w:w="876" w:type="dxa"/>
-            <w:vAlign w:val="center"/>
-          </w:tcPr>
-          <w:p>
-            <w:pPr>
-              <w:shd w:val="clear" w:color="auto" w:fill="FFFFFF" w:themeFill="background1"/>
-              <w:spacing w:line="312" w:lineRule="auto"/>
-              <w:ind w:leftChars="100" w:left="320"/>
-              <w:rPr>
-                <w:rFonts w:ascii="Times New Roman" w:hAnsi="Times New Roman"/>
-                <w:sz w:val="24"/>
-                <w:szCs w:val="24"/>
-              </w:rPr>
-            </w:pPr>
-            <w:r>
-              <w:rPr>
-                <w:rFonts w:ascii="Times New Roman" w:hAnsi="Times New Roman"/>
-                <w:sz w:val="24"/>
-                <w:szCs w:val="24"/>
-              </w:rPr>
-              <w:t>1</w:t>
-            </w:r>
-          </w:p>
-        </w:tc>
-        <w:tc>
-          <w:tcPr>
-            <w:tcW w:w="1560" w:type="dxa"/>
-            <w:vAlign w:val="center"/>
-          </w:tcPr>
-          <w:p>
-            <w:pPr>
-              <w:shd w:val="clear" w:color="auto" w:fill="FFFFFF" w:themeFill="background1"/>
-              <w:spacing w:line="312" w:lineRule="auto"/>
-              <w:ind w:leftChars="100" w:left="320"/>
-              <w:rPr>
-                <w:rFonts w:ascii="Times New Roman" w:hAnsi="Times New Roman"/>
-                <w:sz w:val="24"/>
-                <w:szCs w:val="24"/>
-              </w:rPr>
-            </w:pPr>
-          </w:p>
-        </w:tc>
-        <w:tc>
-          <w:tcPr>
-            <w:tcW w:w="1452" w:type="dxa"/>
-            <w:vAlign w:val="center"/>
-          </w:tcPr>
-          <w:p>
-            <w:pPr>
-              <w:shd w:val="clear" w:color="auto" w:fill="FFFFFF" w:themeFill="background1"/>
-              <w:spacing w:line="312" w:lineRule="auto"/>
-              <w:ind w:leftChars="100" w:left="320"/>
-              <w:rPr>
-                <w:rFonts w:ascii="Times New Roman" w:hAnsi="Times New Roman"/>
-                <w:sz w:val="24"/>
-                <w:szCs w:val="24"/>
-              </w:rPr>
-            </w:pPr>
-          </w:p>
-        </w:tc>
-        <w:tc>
-          <w:tcPr>
-            <w:tcW w:w="1876" w:type="dxa"/>
-            <w:vAlign w:val="center"/>
-          </w:tcPr>
-          <w:p>
-            <w:pPr>
-              <w:shd w:val="clear" w:color="auto" w:fill="FFFFFF" w:themeFill="background1"/>
-              <w:spacing w:line="312" w:lineRule="auto"/>
-              <w:ind w:leftChars="100" w:left="320"/>
-              <w:rPr>
-                <w:rFonts w:ascii="Times New Roman" w:hAnsi="Times New Roman"/>
-                <w:sz w:val="24"/>
-                <w:szCs w:val="24"/>
-              </w:rPr>
-            </w:pPr>
-          </w:p>
-        </w:tc>
-      </w:tr>
-      <w:tr>
-        <w:trPr>
-          <w:trHeight w:val="715"/>
-        </w:trPr>
-        <w:tc>
-          <w:tcPr>
-            <w:tcW w:w="1124" w:type="dxa"/>
-            <w:vAlign w:val="center"/>
-          </w:tcPr>
-          <w:p>
-            <w:pPr>
-              <w:shd w:val="clear" w:color="auto" w:fill="FFFFFF" w:themeFill="background1"/>
-              <w:spacing w:line="312" w:lineRule="auto"/>
-              <w:ind w:leftChars="100" w:left="320"/>
-              <w:jc w:val="center"/>
-              <w:rPr>
-                <w:rFonts w:ascii="Times New Roman" w:hAnsi="Times New Roman"/>
-                <w:b/>
-                <w:bCs/>
-                <w:sz w:val="24"/>
-                <w:szCs w:val="24"/>
-              </w:rPr>
-            </w:pPr>
-          </w:p>
-          <w:p>
-            <w:pPr>
-              <w:shd w:val="clear" w:color="auto" w:fill="FFFFFF" w:themeFill="background1"/>
-              <w:spacing w:line="312" w:lineRule="auto"/>
-              <w:ind w:leftChars="100" w:left="320"/>
-              <w:jc w:val="center"/>
-              <w:rPr>
-                <w:rFonts w:ascii="Times New Roman" w:hAnsi="Times New Roman"/>
-                <w:b/>
-                <w:bCs/>
-                <w:sz w:val="24"/>
-                <w:szCs w:val="24"/>
-              </w:rPr>
-            </w:pPr>
-            <w:r>
-              <w:rPr>
-                <w:rFonts w:ascii="Times New Roman" w:hAnsi="Times New Roman"/>
-                <w:b/>
-                <w:bCs/>
-                <w:sz w:val="24"/>
-                <w:szCs w:val="24"/>
-              </w:rPr>
-              <w:t>3.</w:t>
-            </w:r>
-          </w:p>
-        </w:tc>
-        <w:tc>
-          <w:tcPr>
-            <w:tcW w:w="1496" w:type="dxa"/>
-            <w:vAlign w:val="center"/>
-          </w:tcPr>
-          <w:p>
-            <w:pPr>
-              <w:shd w:val="clear" w:color="auto" w:fill="FFFFFF" w:themeFill="background1"/>
-              <w:spacing w:line="312" w:lineRule="auto"/>
-              <w:rPr>
-                <w:rFonts w:ascii="Times New Roman" w:hAnsi="Times New Roman"/>
-                <w:sz w:val="24"/>
-                <w:szCs w:val="24"/>
-              </w:rPr>
-            </w:pPr>
-            <w:r>
-              <w:rPr>
-                <w:rFonts w:ascii="Times New Roman" w:hAnsi="Times New Roman"/>
-                <w:sz w:val="24"/>
-                <w:szCs w:val="24"/>
-              </w:rPr>
-              <w:t>Công căng backdrop trước sảnh Lux ABCD</w:t>
-            </w:r>
-          </w:p>
-        </w:tc>
-        <w:tc>
-          <w:tcPr>
-            <w:tcW w:w="1444" w:type="dxa"/>
-            <w:vAlign w:val="center"/>
-          </w:tcPr>
-          <w:p>
-            <w:pPr>
-              <w:shd w:val="clear" w:color="auto" w:fill="FFFFFF" w:themeFill="background1"/>
-              <w:spacing w:line="312" w:lineRule="auto"/>
-              <w:ind w:leftChars="100" w:left="320"/>
-              <w:rPr>
-                <w:rFonts w:ascii="Times New Roman" w:hAnsi="Times New Roman"/>
-                <w:sz w:val="24"/>
-                <w:szCs w:val="24"/>
-              </w:rPr>
-            </w:pPr>
-          </w:p>
-        </w:tc>
-        <w:tc>
-          <w:tcPr>
-            <w:tcW w:w="1008" w:type="dxa"/>
-            <w:vAlign w:val="center"/>
-          </w:tcPr>
-          <w:p>
-            <w:pPr>
-              <w:shd w:val="clear" w:color="auto" w:fill="FFFFFF" w:themeFill="background1"/>
-              <w:spacing w:line="312" w:lineRule="auto"/>
-              <w:jc w:val="center"/>
-              <w:rPr>
-                <w:rFonts w:ascii="Times New Roman" w:hAnsi="Times New Roman"/>
-                <w:sz w:val="24"/>
-                <w:szCs w:val="24"/>
-              </w:rPr>
-            </w:pPr>
-            <w:r>
-              <w:rPr>
-                <w:rFonts w:ascii="Times New Roman" w:hAnsi="Times New Roman"/>
-                <w:sz w:val="24"/>
-                <w:szCs w:val="24"/>
-              </w:rPr>
-              <w:t>tấm</w:t>
-            </w:r>
-          </w:p>
-        </w:tc>
-        <w:tc>
-          <w:tcPr>
-            <w:tcW w:w="876" w:type="dxa"/>
-            <w:vAlign w:val="center"/>
-          </w:tcPr>
-          <w:p>
-            <w:pPr>
-              <w:shd w:val="clear" w:color="auto" w:fill="FFFFFF" w:themeFill="background1"/>
-              <w:spacing w:line="312" w:lineRule="auto"/>
-              <w:ind w:leftChars="100" w:left="320"/>
-              <w:rPr>
-                <w:rFonts w:ascii="Times New Roman" w:hAnsi="Times New Roman"/>
-                <w:sz w:val="24"/>
-                <w:szCs w:val="24"/>
-              </w:rPr>
-            </w:pPr>
-            <w:r>
-              <w:rPr>
-                <w:rFonts w:ascii="Times New Roman" w:hAnsi="Times New Roman"/>
-                <w:sz w:val="24"/>
-                <w:szCs w:val="24"/>
-              </w:rPr>
-              <w:t>1</w:t>
-            </w:r>
-          </w:p>
-        </w:tc>
-        <w:tc>
-          <w:tcPr>
-            <w:tcW w:w="1560" w:type="dxa"/>
-            <w:vAlign w:val="center"/>
-          </w:tcPr>
-          <w:p>
-            <w:pPr>
-              <w:shd w:val="clear" w:color="auto" w:fill="FFFFFF" w:themeFill="background1"/>
-              <w:spacing w:line="312" w:lineRule="auto"/>
-              <w:ind w:leftChars="100" w:left="320"/>
-              <w:rPr>
-                <w:rFonts w:ascii="Times New Roman" w:hAnsi="Times New Roman"/>
-                <w:sz w:val="24"/>
-                <w:szCs w:val="24"/>
-              </w:rPr>
-            </w:pPr>
-          </w:p>
-        </w:tc>
-        <w:tc>
-          <w:tcPr>
-            <w:tcW w:w="1452" w:type="dxa"/>
-            <w:vAlign w:val="center"/>
-          </w:tcPr>
-          <w:p>
-            <w:pPr>
-              <w:shd w:val="clear" w:color="auto" w:fill="FFFFFF" w:themeFill="background1"/>
-              <w:spacing w:line="312" w:lineRule="auto"/>
-              <w:ind w:leftChars="100" w:left="320"/>
-              <w:rPr>
-                <w:rFonts w:ascii="Times New Roman" w:hAnsi="Times New Roman"/>
-                <w:sz w:val="24"/>
-                <w:szCs w:val="24"/>
-              </w:rPr>
-            </w:pPr>
-          </w:p>
-        </w:tc>
-        <w:tc>
-          <w:tcPr>
-            <w:tcW w:w="1876" w:type="dxa"/>
-            <w:vAlign w:val="center"/>
-          </w:tcPr>
-          <w:p>
-            <w:pPr>
-              <w:shd w:val="clear" w:color="auto" w:fill="FFFFFF" w:themeFill="background1"/>
-              <w:spacing w:line="312" w:lineRule="auto"/>
-              <w:ind w:leftChars="100" w:left="320"/>
-              <w:rPr>
-                <w:rFonts w:ascii="Times New Roman" w:hAnsi="Times New Roman"/>
-                <w:sz w:val="24"/>
-                <w:szCs w:val="24"/>
-              </w:rPr>
-            </w:pPr>
-          </w:p>
-        </w:tc>
-      </w:tr>
-      <w:tr>
-        <w:trPr>
-          <w:trHeight w:val="715"/>
-        </w:trPr>
-        <w:tc>
-          <w:tcPr>
-            <w:tcW w:w="10836" w:type="dxa"/>
-            <w:gridSpan w:val="8"/>
-            <w:vAlign w:val="center"/>
-          </w:tcPr>
-          <w:p>
-            <w:pPr>
-              <w:shd w:val="clear" w:color="auto" w:fill="FFFFFF" w:themeFill="background1"/>
-              <w:spacing w:line="312" w:lineRule="auto"/>
-              <w:ind w:leftChars="100" w:left="320"/>
-              <w:jc w:val="center"/>
-              <w:rPr>
-                <w:rFonts w:ascii="Times New Roman" w:hAnsi="Times New Roman"/>
-                <w:sz w:val="24"/>
-                <w:szCs w:val="24"/>
-              </w:rPr>
-            </w:pPr>
-            <w:r>
-              <w:rPr>
-                <w:rFonts w:ascii="Times New Roman" w:hAnsi="Times New Roman"/>
-                <w:b/>
-                <w:bCs/>
-                <w:sz w:val="24"/>
-                <w:szCs w:val="24"/>
-              </w:rPr>
-              <w:t>Ngày….Triển lãm Sảnh Lux ABCD</w:t>
-            </w:r>
-          </w:p>
-        </w:tc>
-      </w:tr>
-      <w:tr>
-        <w:trPr>
-          <w:trHeight w:val="715"/>
-        </w:trPr>
-        <w:tc>
-          <w:tcPr>
-            <w:tcW w:w="1124" w:type="dxa"/>
-            <w:vAlign w:val="center"/>
-          </w:tcPr>
-          <w:p>
-            <w:pPr>
-              <w:shd w:val="clear" w:color="auto" w:fill="FFFFFF" w:themeFill="background1"/>
-              <w:spacing w:line="312" w:lineRule="auto"/>
-              <w:ind w:leftChars="100" w:left="320"/>
-              <w:jc w:val="center"/>
-              <w:rPr>
-                <w:rFonts w:ascii="Times New Roman" w:hAnsi="Times New Roman"/>
-                <w:b/>
-                <w:bCs/>
-                <w:sz w:val="24"/>
-                <w:szCs w:val="24"/>
-              </w:rPr>
-            </w:pPr>
-          </w:p>
-          <w:p>
-            <w:pPr>
-              <w:shd w:val="clear" w:color="auto" w:fill="FFFFFF" w:themeFill="background1"/>
-              <w:spacing w:line="312" w:lineRule="auto"/>
-              <w:ind w:leftChars="100" w:left="320"/>
-              <w:jc w:val="center"/>
-              <w:rPr>
-                <w:rFonts w:ascii="Times New Roman" w:hAnsi="Times New Roman"/>
-                <w:b/>
-                <w:bCs/>
-                <w:sz w:val="24"/>
-                <w:szCs w:val="24"/>
-              </w:rPr>
-            </w:pPr>
-            <w:r>
-              <w:rPr>
-                <w:rFonts w:ascii="Times New Roman" w:hAnsi="Times New Roman"/>
-                <w:b/>
-                <w:bCs/>
-                <w:sz w:val="24"/>
-                <w:szCs w:val="24"/>
-              </w:rPr>
-              <w:t>1.</w:t>
-            </w:r>
-          </w:p>
-        </w:tc>
-        <w:tc>
-          <w:tcPr>
-            <w:tcW w:w="1496" w:type="dxa"/>
-            <w:vAlign w:val="center"/>
-          </w:tcPr>
-          <w:p>
-            <w:pPr>
-              <w:shd w:val="clear" w:color="auto" w:fill="FFFFFF" w:themeFill="background1"/>
-              <w:spacing w:line="312" w:lineRule="auto"/>
-              <w:rPr>
-                <w:rFonts w:ascii="Times New Roman" w:hAnsi="Times New Roman"/>
-                <w:sz w:val="24"/>
-                <w:szCs w:val="24"/>
-              </w:rPr>
-            </w:pPr>
-            <w:r>
-              <w:rPr>
-                <w:rFonts w:ascii="Times New Roman" w:hAnsi="Times New Roman"/>
-                <w:sz w:val="24"/>
-                <w:szCs w:val="24"/>
-              </w:rPr>
-              <w:t>Phí thuê sảnh hội nghị Lux ABCD</w:t>
-            </w:r>
-          </w:p>
-        </w:tc>
-        <w:tc>
-          <w:tcPr>
-            <w:tcW w:w="1444" w:type="dxa"/>
-            <w:vAlign w:val="center"/>
-          </w:tcPr>
-          <w:p>
-            <w:pPr>
-              <w:shd w:val="clear" w:color="auto" w:fill="FFFFFF" w:themeFill="background1"/>
-              <w:spacing w:line="312" w:lineRule="auto"/>
-              <w:ind w:leftChars="100" w:left="320"/>
-              <w:rPr>
-                <w:rFonts w:ascii="Times New Roman" w:hAnsi="Times New Roman"/>
-                <w:sz w:val="24"/>
-                <w:szCs w:val="24"/>
-              </w:rPr>
-            </w:pPr>
-            <w:r>
-              <w:rPr>
-                <w:rFonts w:ascii="Times New Roman" w:hAnsi="Times New Roman"/>
-                <w:sz w:val="24"/>
-                <w:szCs w:val="24"/>
-              </w:rPr>
-              <w:t>08h00-17h00</w:t>
-            </w:r>
-          </w:p>
-        </w:tc>
-        <w:tc>
-          <w:tcPr>
-            <w:tcW w:w="1008" w:type="dxa"/>
-            <w:vAlign w:val="center"/>
-          </w:tcPr>
-          <w:p>
-            <w:pPr>
-              <w:shd w:val="clear" w:color="auto" w:fill="FFFFFF" w:themeFill="background1"/>
-              <w:spacing w:line="312" w:lineRule="auto"/>
-              <w:rPr>
-                <w:rFonts w:ascii="Times New Roman" w:hAnsi="Times New Roman"/>
-                <w:sz w:val="24"/>
-                <w:szCs w:val="24"/>
-              </w:rPr>
-            </w:pPr>
-            <w:r>
-              <w:rPr>
-                <w:rFonts w:ascii="Times New Roman" w:hAnsi="Times New Roman"/>
-                <w:sz w:val="24"/>
-                <w:szCs w:val="24"/>
-              </w:rPr>
-              <w:t>nửa ngày</w:t>
-            </w:r>
-          </w:p>
-        </w:tc>
-        <w:tc>
-          <w:tcPr>
-            <w:tcW w:w="876" w:type="dxa"/>
-            <w:vAlign w:val="center"/>
-          </w:tcPr>
-          <w:p>
-            <w:pPr>
-              <w:shd w:val="clear" w:color="auto" w:fill="FFFFFF" w:themeFill="background1"/>
-              <w:spacing w:line="312" w:lineRule="auto"/>
-              <w:ind w:leftChars="100" w:left="320"/>
-              <w:jc w:val="center"/>
-              <w:rPr>
-                <w:rFonts w:ascii="Times New Roman" w:hAnsi="Times New Roman"/>
-                <w:sz w:val="24"/>
-                <w:szCs w:val="24"/>
-              </w:rPr>
-            </w:pPr>
-            <w:r>
-              <w:rPr>
-                <w:rFonts w:ascii="Times New Roman" w:hAnsi="Times New Roman"/>
-                <w:sz w:val="24"/>
-                <w:szCs w:val="24"/>
-              </w:rPr>
-              <w:t>1</w:t>
-            </w:r>
-          </w:p>
-        </w:tc>
-        <w:tc>
-          <w:tcPr>
-            <w:tcW w:w="1560" w:type="dxa"/>
-            <w:vAlign w:val="center"/>
-          </w:tcPr>
-          <w:p>
-            <w:pPr>
-              <w:shd w:val="clear" w:color="auto" w:fill="FFFFFF" w:themeFill="background1"/>
-              <w:spacing w:line="312" w:lineRule="auto"/>
-              <w:ind w:leftChars="100" w:left="320"/>
-              <w:rPr>
-                <w:rFonts w:ascii="Times New Roman" w:hAnsi="Times New Roman"/>
-                <w:sz w:val="24"/>
-                <w:szCs w:val="24"/>
-              </w:rPr>
-            </w:pPr>
-          </w:p>
-        </w:tc>
-        <w:tc>
-          <w:tcPr>
-            <w:tcW w:w="1452" w:type="dxa"/>
-            <w:vAlign w:val="center"/>
-          </w:tcPr>
-          <w:p>
-            <w:pPr>
-              <w:shd w:val="clear" w:color="auto" w:fill="FFFFFF" w:themeFill="background1"/>
-              <w:spacing w:line="312" w:lineRule="auto"/>
-              <w:ind w:leftChars="100" w:left="320"/>
-              <w:rPr>
-                <w:rFonts w:ascii="Times New Roman" w:hAnsi="Times New Roman"/>
-                <w:sz w:val="24"/>
-                <w:szCs w:val="24"/>
-              </w:rPr>
-            </w:pPr>
-          </w:p>
-        </w:tc>
-        <w:tc>
-          <w:tcPr>
-            <w:tcW w:w="1876" w:type="dxa"/>
-            <w:vAlign w:val="center"/>
-          </w:tcPr>
-          <w:p>
-            <w:pPr>
-              <w:shd w:val="clear" w:color="auto" w:fill="FFFFFF" w:themeFill="background1"/>
-              <w:spacing w:line="312" w:lineRule="auto"/>
-              <w:ind w:leftChars="100" w:left="320"/>
-              <w:rPr>
-                <w:rFonts w:ascii="Times New Roman" w:hAnsi="Times New Roman"/>
-                <w:sz w:val="24"/>
-                <w:szCs w:val="24"/>
-              </w:rPr>
-            </w:pPr>
-          </w:p>
-        </w:tc>
-      </w:tr>
-      <w:tr>
-        <w:trPr>
-          <w:trHeight w:val="715"/>
-        </w:trPr>
-        <w:tc>
-          <w:tcPr>
-            <w:tcW w:w="1124" w:type="dxa"/>
-            <w:vAlign w:val="center"/>
-          </w:tcPr>
-          <w:p>
-            <w:pPr>
-              <w:shd w:val="clear" w:color="auto" w:fill="FFFFFF" w:themeFill="background1"/>
-              <w:spacing w:line="312" w:lineRule="auto"/>
-              <w:ind w:leftChars="100" w:left="320"/>
-              <w:jc w:val="center"/>
-              <w:rPr>
-                <w:rFonts w:ascii="Times New Roman" w:hAnsi="Times New Roman"/>
-                <w:b/>
-                <w:bCs/>
-                <w:sz w:val="24"/>
-                <w:szCs w:val="24"/>
-              </w:rPr>
-            </w:pPr>
-            <w:r>
-              <w:rPr>
-                <w:rFonts w:ascii="Times New Roman" w:hAnsi="Times New Roman"/>
-                <w:b/>
-                <w:bCs/>
-                <w:sz w:val="24"/>
-                <w:szCs w:val="24"/>
-              </w:rPr>
-              <w:t>2.</w:t>
-            </w:r>
-          </w:p>
-        </w:tc>
-        <w:tc>
-          <w:tcPr>
-            <w:tcW w:w="1496" w:type="dxa"/>
-            <w:vAlign w:val="center"/>
-          </w:tcPr>
-          <w:p>
-            <w:pPr>
-              <w:shd w:val="clear" w:color="auto" w:fill="FFFFFF" w:themeFill="background1"/>
-              <w:spacing w:line="312" w:lineRule="auto"/>
-              <w:rPr>
-                <w:rFonts w:ascii="Times New Roman" w:hAnsi="Times New Roman"/>
-                <w:sz w:val="24"/>
-                <w:szCs w:val="24"/>
-              </w:rPr>
-            </w:pPr>
-            <w:r>
-              <w:rPr>
-                <w:rFonts w:ascii="Times New Roman" w:hAnsi="Times New Roman"/>
-                <w:sz w:val="24"/>
-                <w:szCs w:val="24"/>
-                <w:lang w:eastAsia="zh-CN"/>
-              </w:rPr>
-              <w:t>Phí đem âm thanh ánh sáng bên ngoài vào</w:t>
-            </w:r>
-          </w:p>
-        </w:tc>
-        <w:tc>
-          <w:tcPr>
-            <w:tcW w:w="1444" w:type="dxa"/>
-            <w:vAlign w:val="center"/>
-          </w:tcPr>
-          <w:p>
-            <w:pPr>
-              <w:shd w:val="clear" w:color="auto" w:fill="FFFFFF" w:themeFill="background1"/>
-              <w:spacing w:line="312" w:lineRule="auto"/>
-              <w:ind w:leftChars="100" w:left="320"/>
-              <w:rPr>
-                <w:rFonts w:ascii="Times New Roman" w:hAnsi="Times New Roman"/>
-                <w:sz w:val="24"/>
-                <w:szCs w:val="24"/>
-              </w:rPr>
-            </w:pPr>
-            <w:r>
-              <w:rPr>
-                <w:rFonts w:ascii="Times New Roman" w:hAnsi="Times New Roman"/>
-                <w:sz w:val="24"/>
-                <w:szCs w:val="24"/>
-              </w:rPr>
-              <w:t>08h00-17h00</w:t>
-            </w:r>
-          </w:p>
-        </w:tc>
-        <w:tc>
-          <w:tcPr>
-            <w:tcW w:w="1008" w:type="dxa"/>
-            <w:vAlign w:val="center"/>
-          </w:tcPr>
-          <w:p>
-            <w:pPr>
-              <w:shd w:val="clear" w:color="auto" w:fill="FFFFFF" w:themeFill="background1"/>
-              <w:spacing w:line="312" w:lineRule="auto"/>
-              <w:jc w:val="center"/>
-              <w:rPr>
-                <w:rFonts w:ascii="Times New Roman" w:hAnsi="Times New Roman"/>
-                <w:sz w:val="24"/>
-                <w:szCs w:val="24"/>
-              </w:rPr>
-            </w:pPr>
-            <w:r>
-              <w:rPr>
-                <w:rFonts w:ascii="Times New Roman" w:hAnsi="Times New Roman"/>
-                <w:sz w:val="24"/>
-                <w:szCs w:val="24"/>
-              </w:rPr>
-              <w:t>Gói</w:t>
-            </w:r>
-          </w:p>
-        </w:tc>
-        <w:tc>
-          <w:tcPr>
-            <w:tcW w:w="876" w:type="dxa"/>
-            <w:vAlign w:val="center"/>
-          </w:tcPr>
-          <w:p>
-            <w:pPr>
-              <w:shd w:val="clear" w:color="auto" w:fill="FFFFFF" w:themeFill="background1"/>
-              <w:spacing w:line="312" w:lineRule="auto"/>
-              <w:ind w:leftChars="100" w:left="320"/>
-              <w:rPr>
-                <w:rFonts w:ascii="Times New Roman" w:hAnsi="Times New Roman"/>
-                <w:sz w:val="24"/>
-                <w:szCs w:val="24"/>
-              </w:rPr>
-            </w:pPr>
-            <w:r>
-              <w:rPr>
-                <w:rFonts w:ascii="Times New Roman" w:hAnsi="Times New Roman"/>
-                <w:sz w:val="24"/>
-                <w:szCs w:val="24"/>
-              </w:rPr>
-              <w:t>1</w:t>
-            </w:r>
-          </w:p>
-        </w:tc>
-        <w:tc>
-          <w:tcPr>
-            <w:tcW w:w="1560" w:type="dxa"/>
-            <w:vAlign w:val="center"/>
-          </w:tcPr>
-          <w:p>
-            <w:pPr>
-              <w:shd w:val="clear" w:color="auto" w:fill="FFFFFF" w:themeFill="background1"/>
-              <w:spacing w:line="312" w:lineRule="auto"/>
-              <w:ind w:leftChars="100" w:left="320"/>
-              <w:rPr>
-                <w:rFonts w:ascii="Times New Roman" w:hAnsi="Times New Roman"/>
-                <w:sz w:val="24"/>
-                <w:szCs w:val="24"/>
-              </w:rPr>
-            </w:pPr>
-          </w:p>
-        </w:tc>
-        <w:tc>
-          <w:tcPr>
-            <w:tcW w:w="1452" w:type="dxa"/>
-            <w:vAlign w:val="center"/>
-          </w:tcPr>
-          <w:p>
-            <w:pPr>
-              <w:shd w:val="clear" w:color="auto" w:fill="FFFFFF" w:themeFill="background1"/>
-              <w:spacing w:line="312" w:lineRule="auto"/>
-              <w:ind w:leftChars="100" w:left="320"/>
-              <w:rPr>
-                <w:rFonts w:ascii="Times New Roman" w:hAnsi="Times New Roman"/>
-                <w:sz w:val="24"/>
-                <w:szCs w:val="24"/>
-              </w:rPr>
-            </w:pPr>
-          </w:p>
-        </w:tc>
-        <w:tc>
-          <w:tcPr>
-            <w:tcW w:w="1876" w:type="dxa"/>
-            <w:vAlign w:val="center"/>
-          </w:tcPr>
-          <w:p>
-            <w:pPr>
-              <w:shd w:val="clear" w:color="auto" w:fill="FFFFFF" w:themeFill="background1"/>
-              <w:spacing w:line="312" w:lineRule="auto"/>
-              <w:ind w:leftChars="100" w:left="320"/>
-              <w:rPr>
-                <w:rFonts w:ascii="Times New Roman" w:hAnsi="Times New Roman"/>
-                <w:sz w:val="24"/>
-                <w:szCs w:val="24"/>
-              </w:rPr>
-            </w:pPr>
-          </w:p>
-        </w:tc>
-      </w:tr>
-      <w:tr>
-        <w:trPr>
-          <w:trHeight w:val="1057"/>
-        </w:trPr>
-        <w:tc>
-          <w:tcPr>
-            <w:tcW w:w="10836" w:type="dxa"/>
-            <w:gridSpan w:val="8"/>
-            <w:vAlign w:val="center"/>
-          </w:tcPr>
-          <w:p>
-            <w:pPr>
-              <w:shd w:val="clear" w:color="auto" w:fill="FFFFFF" w:themeFill="background1"/>
-              <w:spacing w:line="312" w:lineRule="auto"/>
-              <w:ind w:leftChars="100" w:left="320"/>
-              <w:jc w:val="center"/>
-              <w:rPr>
-                <w:rFonts w:ascii="Times New Roman" w:hAnsi="Times New Roman"/>
-                <w:sz w:val="24"/>
-                <w:szCs w:val="24"/>
-              </w:rPr>
-            </w:pPr>
-            <w:r>
-              <w:rPr>
-                <w:rFonts w:ascii="Times New Roman" w:hAnsi="Times New Roman"/>
-                <w:b/>
-                <w:bCs/>
-                <w:sz w:val="24"/>
-                <w:szCs w:val="24"/>
-              </w:rPr>
-              <w:t>Ngày….Tiệc tối - Sảnh Lux E</w:t>
-            </w:r>
-          </w:p>
-        </w:tc>
-      </w:tr>
-      <w:tr>
-        <w:trPr>
-          <w:trHeight w:val="1057"/>
-        </w:trPr>
-        <w:tc>
-          <w:tcPr>
-            <w:tcW w:w="1124" w:type="dxa"/>
-            <w:vAlign w:val="center"/>
-          </w:tcPr>
-          <w:p>
-            <w:pPr>
-              <w:numPr>
-                <w:ilvl w:val="0"/>
-                <w:numId w:val="4"/>
-              </w:numPr>
-              <w:shd w:val="clear" w:color="auto" w:fill="FFFFFF" w:themeFill="background1"/>
-              <w:spacing w:line="312" w:lineRule="auto"/>
-              <w:ind w:leftChars="100" w:left="320"/>
-              <w:jc w:val="both"/>
-              <w:rPr>
-                <w:rFonts w:ascii="Times New Roman" w:hAnsi="Times New Roman"/>
-                <w:b/>
-                <w:bCs/>
-                <w:sz w:val="24"/>
-                <w:szCs w:val="24"/>
-              </w:rPr>
-            </w:pPr>
-          </w:p>
-        </w:tc>
-        <w:tc>
-          <w:tcPr>
-            <w:tcW w:w="1496" w:type="dxa"/>
-            <w:vAlign w:val="center"/>
-          </w:tcPr>
-          <w:p>
-            <w:pPr>
-              <w:shd w:val="clear" w:color="auto" w:fill="FFFFFF" w:themeFill="background1"/>
-              <w:spacing w:line="312" w:lineRule="auto"/>
-              <w:rPr>
-                <w:rFonts w:ascii="Times New Roman" w:hAnsi="Times New Roman"/>
-                <w:sz w:val="24"/>
-                <w:szCs w:val="24"/>
-              </w:rPr>
-            </w:pPr>
-            <w:r>
-              <w:rPr>
-                <w:rFonts w:ascii="Times New Roman" w:hAnsi="Times New Roman"/>
-                <w:sz w:val="24"/>
-                <w:szCs w:val="24"/>
-              </w:rPr>
-              <w:t>Thực đơn</w:t>
-            </w:r>
-          </w:p>
-        </w:tc>
-        <w:tc>
-          <w:tcPr>
-            <w:tcW w:w="1444" w:type="dxa"/>
-            <w:vAlign w:val="center"/>
-          </w:tcPr>
-          <w:p>
-            <w:pPr>
-              <w:shd w:val="clear" w:color="auto" w:fill="FFFFFF" w:themeFill="background1"/>
-              <w:spacing w:line="312" w:lineRule="auto"/>
-              <w:ind w:leftChars="100" w:left="320"/>
-              <w:rPr>
-                <w:rFonts w:ascii="Times New Roman" w:hAnsi="Times New Roman"/>
-                <w:sz w:val="24"/>
-                <w:szCs w:val="24"/>
-              </w:rPr>
-            </w:pPr>
-            <w:r>
-              <w:rPr>
-                <w:rFonts w:ascii="Times New Roman" w:hAnsi="Times New Roman"/>
-                <w:sz w:val="24"/>
-                <w:szCs w:val="24"/>
-              </w:rPr>
-              <w:t>18h00 -21h30</w:t>
-            </w:r>
-          </w:p>
-        </w:tc>
-        <w:tc>
-          <w:tcPr>
-            <w:tcW w:w="1008" w:type="dxa"/>
-            <w:vAlign w:val="center"/>
-          </w:tcPr>
-          <w:p>
-            <w:pPr>
-              <w:shd w:val="clear" w:color="auto" w:fill="FFFFFF" w:themeFill="background1"/>
-              <w:spacing w:line="312" w:lineRule="auto"/>
-              <w:rPr>
-                <w:rFonts w:ascii="Times New Roman" w:hAnsi="Times New Roman"/>
-                <w:sz w:val="24"/>
-                <w:szCs w:val="24"/>
-              </w:rPr>
-            </w:pPr>
-            <w:r>
-              <w:rPr>
-                <w:rFonts w:ascii="Times New Roman" w:hAnsi="Times New Roman"/>
-                <w:sz w:val="24"/>
-                <w:szCs w:val="24"/>
-              </w:rPr>
-              <w:t>Bàn/10 khách</w:t>
-            </w:r>
-          </w:p>
-        </w:tc>
-        <w:tc>
-          <w:tcPr>
-            <w:tcW w:w="876" w:type="dxa"/>
-            <w:vAlign w:val="center"/>
-          </w:tcPr>
-          <w:p>
-            <w:pPr>
-              <w:shd w:val="clear" w:color="auto" w:fill="FFFFFF" w:themeFill="background1"/>
-              <w:spacing w:line="312" w:lineRule="auto"/>
-              <w:ind w:leftChars="100" w:left="320"/>
-              <w:jc w:val="center"/>
-              <w:rPr>
-                <w:rFonts w:ascii="Times New Roman" w:hAnsi="Times New Roman"/>
-                <w:sz w:val="24"/>
-                <w:szCs w:val="24"/>
-              </w:rPr>
-            </w:pPr>
-            <w:r>
-              <w:rPr>
-                <w:rFonts w:ascii="Times New Roman" w:hAnsi="Times New Roman"/>
-                <w:sz w:val="24"/>
-                <w:szCs w:val="24"/>
-              </w:rPr>
-              <w:t>28</w:t>
-            </w:r>
-          </w:p>
-        </w:tc>
-        <w:tc>
-          <w:tcPr>
-            <w:tcW w:w="1560" w:type="dxa"/>
-            <w:vAlign w:val="center"/>
-          </w:tcPr>
-          <w:p>
-            <w:pPr>
-              <w:shd w:val="clear" w:color="auto" w:fill="FFFFFF" w:themeFill="background1"/>
-              <w:spacing w:line="312" w:lineRule="auto"/>
-              <w:ind w:leftChars="100" w:left="320"/>
-              <w:rPr>
-                <w:rFonts w:ascii="Times New Roman" w:hAnsi="Times New Roman"/>
-                <w:sz w:val="24"/>
-                <w:szCs w:val="24"/>
-              </w:rPr>
-            </w:pPr>
-          </w:p>
-        </w:tc>
-        <w:tc>
-          <w:tcPr>
-            <w:tcW w:w="1452" w:type="dxa"/>
-            <w:vAlign w:val="center"/>
-          </w:tcPr>
-          <w:p>
-            <w:pPr>
-              <w:shd w:val="clear" w:color="auto" w:fill="FFFFFF" w:themeFill="background1"/>
-              <w:spacing w:line="312" w:lineRule="auto"/>
-              <w:ind w:leftChars="100" w:left="320"/>
-              <w:rPr>
-                <w:rFonts w:ascii="Times New Roman" w:hAnsi="Times New Roman"/>
-                <w:sz w:val="24"/>
-                <w:szCs w:val="24"/>
-              </w:rPr>
-            </w:pPr>
-          </w:p>
-        </w:tc>
-        <w:tc>
-          <w:tcPr>
-            <w:tcW w:w="1876" w:type="dxa"/>
-            <w:vAlign w:val="center"/>
-          </w:tcPr>
-          <w:p>
-            <w:pPr>
-              <w:shd w:val="clear" w:color="auto" w:fill="FFFFFF" w:themeFill="background1"/>
-              <w:spacing w:line="312" w:lineRule="auto"/>
-              <w:ind w:leftChars="100" w:left="320"/>
-              <w:rPr>
-                <w:rFonts w:ascii="Times New Roman" w:hAnsi="Times New Roman"/>
-                <w:sz w:val="24"/>
-                <w:szCs w:val="24"/>
-              </w:rPr>
-            </w:pPr>
-          </w:p>
-        </w:tc>
-      </w:tr>
-      <w:tr>
-        <w:trPr>
-          <w:trHeight w:val="1057"/>
-        </w:trPr>
-        <w:tc>
-          <w:tcPr>
-            <w:tcW w:w="1124" w:type="dxa"/>
-            <w:vAlign w:val="center"/>
-          </w:tcPr>
-          <w:p>
-            <w:pPr>
-              <w:numPr>
-                <w:ilvl w:val="0"/>
-                <w:numId w:val="4"/>
-              </w:numPr>
-              <w:shd w:val="clear" w:color="auto" w:fill="FFFFFF" w:themeFill="background1"/>
-              <w:spacing w:line="312" w:lineRule="auto"/>
-              <w:ind w:leftChars="100" w:left="320"/>
-              <w:jc w:val="both"/>
-              <w:rPr>
-                <w:rFonts w:ascii="Times New Roman" w:hAnsi="Times New Roman"/>
-                <w:b/>
-                <w:bCs/>
-                <w:sz w:val="24"/>
-                <w:szCs w:val="24"/>
-              </w:rPr>
-            </w:pPr>
-          </w:p>
-        </w:tc>
-        <w:tc>
-          <w:tcPr>
-            <w:tcW w:w="1496" w:type="dxa"/>
-            <w:vAlign w:val="center"/>
-          </w:tcPr>
-          <w:p>
-            <w:pPr>
-              <w:shd w:val="clear" w:color="auto" w:fill="FFFFFF" w:themeFill="background1"/>
-              <w:spacing w:line="312" w:lineRule="auto"/>
-              <w:rPr>
-                <w:rFonts w:ascii="Times New Roman" w:hAnsi="Times New Roman"/>
-                <w:sz w:val="24"/>
-                <w:szCs w:val="24"/>
-              </w:rPr>
-            </w:pPr>
-            <w:r>
-              <w:rPr>
-                <w:rFonts w:ascii="Times New Roman" w:hAnsi="Times New Roman"/>
-                <w:sz w:val="24"/>
-                <w:szCs w:val="24"/>
-                <w:lang w:eastAsia="zh-CN"/>
-              </w:rPr>
-              <w:t>Màn hình Led trong tiệc 12m2</w:t>
-            </w:r>
-          </w:p>
-        </w:tc>
-        <w:tc>
-          <w:tcPr>
-            <w:tcW w:w="1444" w:type="dxa"/>
-            <w:vAlign w:val="center"/>
-          </w:tcPr>
-          <w:p>
-            <w:pPr>
-              <w:shd w:val="clear" w:color="auto" w:fill="FFFFFF" w:themeFill="background1"/>
-              <w:spacing w:line="312" w:lineRule="auto"/>
-              <w:rPr>
-                <w:rFonts w:ascii="Times New Roman" w:hAnsi="Times New Roman"/>
-                <w:sz w:val="24"/>
-                <w:szCs w:val="24"/>
-              </w:rPr>
-            </w:pPr>
-            <w:r>
-              <w:rPr>
-                <w:rFonts w:ascii="Times New Roman" w:hAnsi="Times New Roman"/>
-                <w:sz w:val="24"/>
-                <w:szCs w:val="24"/>
-              </w:rPr>
-              <w:t>18h00 -21h30</w:t>
-            </w:r>
-          </w:p>
-        </w:tc>
-        <w:tc>
-          <w:tcPr>
-            <w:tcW w:w="1008" w:type="dxa"/>
-            <w:vAlign w:val="center"/>
-          </w:tcPr>
-          <w:p>
-            <w:pPr>
-              <w:shd w:val="clear" w:color="auto" w:fill="FFFFFF" w:themeFill="background1"/>
-              <w:spacing w:line="312" w:lineRule="auto"/>
-              <w:rPr>
-                <w:rFonts w:ascii="Times New Roman" w:hAnsi="Times New Roman"/>
-                <w:sz w:val="24"/>
-                <w:szCs w:val="24"/>
-              </w:rPr>
-            </w:pPr>
-            <w:r>
-              <w:rPr>
-                <w:rFonts w:ascii="Times New Roman" w:hAnsi="Times New Roman"/>
-                <w:sz w:val="24"/>
-                <w:szCs w:val="24"/>
-              </w:rPr>
-              <w:t>Show</w:t>
-            </w:r>
-          </w:p>
-        </w:tc>
-        <w:tc>
-          <w:tcPr>
-            <w:tcW w:w="876" w:type="dxa"/>
-            <w:vAlign w:val="center"/>
-          </w:tcPr>
-          <w:p>
-            <w:pPr>
-              <w:shd w:val="clear" w:color="auto" w:fill="FFFFFF" w:themeFill="background1"/>
-              <w:spacing w:line="312" w:lineRule="auto"/>
-              <w:jc w:val="center"/>
-              <w:rPr>
-                <w:rFonts w:ascii="Times New Roman" w:hAnsi="Times New Roman"/>
-                <w:sz w:val="24"/>
-                <w:szCs w:val="24"/>
-              </w:rPr>
-            </w:pPr>
-            <w:r>
-              <w:rPr>
-                <w:rFonts w:ascii="Times New Roman" w:hAnsi="Times New Roman"/>
-                <w:sz w:val="24"/>
-                <w:szCs w:val="24"/>
-              </w:rPr>
-              <w:t>1</w:t>
-            </w:r>
-          </w:p>
-        </w:tc>
-        <w:tc>
-          <w:tcPr>
-            <w:tcW w:w="1560" w:type="dxa"/>
-            <w:vAlign w:val="center"/>
-          </w:tcPr>
-          <w:p>
-            <w:pPr>
-              <w:shd w:val="clear" w:color="auto" w:fill="FFFFFF" w:themeFill="background1"/>
-              <w:spacing w:line="312" w:lineRule="auto"/>
-              <w:rPr>
-                <w:rFonts w:ascii="Times New Roman" w:hAnsi="Times New Roman"/>
-                <w:sz w:val="24"/>
-                <w:szCs w:val="24"/>
-              </w:rPr>
-            </w:pPr>
-          </w:p>
-        </w:tc>
-        <w:tc>
-          <w:tcPr>
-            <w:tcW w:w="1452" w:type="dxa"/>
-            <w:vAlign w:val="center"/>
-          </w:tcPr>
-          <w:p>
-            <w:pPr>
-              <w:shd w:val="clear" w:color="auto" w:fill="FFFFFF" w:themeFill="background1"/>
-              <w:spacing w:line="312" w:lineRule="auto"/>
-              <w:rPr>
-                <w:rFonts w:ascii="Times New Roman" w:hAnsi="Times New Roman"/>
-                <w:sz w:val="24"/>
-                <w:szCs w:val="24"/>
-              </w:rPr>
-            </w:pPr>
-          </w:p>
-        </w:tc>
-        <w:tc>
-          <w:tcPr>
-            <w:tcW w:w="1876" w:type="dxa"/>
-            <w:vAlign w:val="center"/>
-          </w:tcPr>
-          <w:p>
-            <w:pPr>
-              <w:shd w:val="clear" w:color="auto" w:fill="FFFFFF" w:themeFill="background1"/>
-              <w:spacing w:line="312" w:lineRule="auto"/>
-              <w:rPr>
-                <w:rFonts w:ascii="Times New Roman" w:hAnsi="Times New Roman"/>
-                <w:sz w:val="24"/>
-                <w:szCs w:val="24"/>
-              </w:rPr>
-            </w:pPr>
           </w:p>
         </w:tc>
       </w:tr>
@@ -5404,26 +2805,8 @@
             <w:vAlign w:val="center"/>
           </w:tcPr>
           <w:p>
-            <w:pPr>
-              <w:shd w:val="clear" w:color="auto" w:fill="FFFFFF" w:themeFill="background1"/>
-              <w:spacing w:line="312" w:lineRule="auto"/>
-              <w:ind w:leftChars="100" w:left="320"/>
-              <w:jc w:val="center"/>
-              <w:rPr>
-                <w:rFonts w:ascii="Times New Roman" w:hAnsi="Times New Roman"/>
-                <w:sz w:val="24"/>
-                <w:szCs w:val="24"/>
-              </w:rPr>
-            </w:pPr>
             <w:r>
-              <w:rPr>
-                <w:rFonts w:ascii="Times New Roman" w:hAnsi="Times New Roman"/>
-                <w:b/>
-                <w:bCs/>
-                <w:sz w:val="24"/>
-                <w:szCs w:val="24"/>
-              </w:rPr>
-              <w:t>THÀNH TIỀN</w:t>
+              <w:t>{MucPhiPhucVu}% PHÍ PHỤC VỤ</w:t>
             </w:r>
           </w:p>
         </w:tc>
@@ -5452,88 +2835,9 @@
             <w:vAlign w:val="center"/>
           </w:tcPr>
           <w:p>
-            <w:pPr>
-              <w:shd w:val="clear" w:color="auto" w:fill="FFFFFF" w:themeFill="background1"/>
-              <w:spacing w:line="312" w:lineRule="auto"/>
-              <w:ind w:leftChars="100" w:left="320"/>
-              <w:jc w:val="right"/>
-              <w:rPr>
-                <w:rFonts w:ascii="Times New Roman" w:hAnsi="Times New Roman"/>
-                <w:sz w:val="24"/>
-                <w:szCs w:val="24"/>
-              </w:rPr>
-            </w:pPr>
-          </w:p>
-        </w:tc>
-      </w:tr>
-      <w:tr>
-        <w:trPr>
-          <w:trHeight w:val="460"/>
-        </w:trPr>
-        <w:tc>
-          <w:tcPr>
-            <w:tcW w:w="7508" w:type="dxa"/>
-            <w:gridSpan w:val="6"/>
-            <w:vAlign w:val="center"/>
-          </w:tcPr>
-          <w:p>
-            <w:pPr>
-              <w:shd w:val="clear" w:color="auto" w:fill="FFFFFF" w:themeFill="background1"/>
-              <w:spacing w:line="312" w:lineRule="auto"/>
-              <w:ind w:leftChars="100" w:left="320"/>
-              <w:jc w:val="center"/>
-              <w:rPr>
-                <w:rFonts w:ascii="Times New Roman" w:hAnsi="Times New Roman"/>
-                <w:sz w:val="24"/>
-                <w:szCs w:val="24"/>
-              </w:rPr>
-            </w:pPr>
             <w:r>
-              <w:rPr>
-                <w:rFonts w:ascii="Times New Roman" w:hAnsi="Times New Roman"/>
-                <w:sz w:val="24"/>
-                <w:szCs w:val="24"/>
-              </w:rPr>
-              <w:t>5% PHÍ PHỤC VỤ</w:t>
+              <w:t>{PhiPhucVu}</w:t>
             </w:r>
-          </w:p>
-        </w:tc>
-        <w:tc>
-          <w:tcPr>
-            <w:tcW w:w="1452" w:type="dxa"/>
-            <w:vAlign w:val="center"/>
-          </w:tcPr>
-          <w:p>
-            <w:pPr>
-              <w:shd w:val="clear" w:color="auto" w:fill="FFFFFF" w:themeFill="background1"/>
-              <w:spacing w:line="312" w:lineRule="auto"/>
-              <w:ind w:leftChars="100" w:left="320"/>
-              <w:jc w:val="right"/>
-              <w:rPr>
-                <w:rFonts w:ascii="Times New Roman" w:hAnsi="Times New Roman"/>
-                <w:sz w:val="24"/>
-                <w:szCs w:val="24"/>
-              </w:rPr>
-            </w:pPr>
-          </w:p>
-        </w:tc>
-        <w:tc>
-          <w:tcPr>
-            <w:tcW w:w="1876" w:type="dxa"/>
-            <w:vAlign w:val="center"/>
-          </w:tcPr>
-          <w:p>
-            <w:pPr>
-              <w:shd w:val="clear" w:color="auto" w:fill="FFFFFF" w:themeFill="background1"/>
-              <w:spacing w:line="312" w:lineRule="auto"/>
-              <w:ind w:leftChars="100" w:left="320"/>
-              <w:jc w:val="right"/>
-              <w:rPr>
-                <w:rFonts w:ascii="Times New Roman" w:hAnsi="Times New Roman"/>
-                <w:sz w:val="24"/>
-                <w:szCs w:val="24"/>
-              </w:rPr>
-            </w:pPr>
           </w:p>
         </w:tc>
       </w:tr>
@@ -5596,17 +2900,9 @@
             <w:vAlign w:val="center"/>
           </w:tcPr>
           <w:p>
-            <w:pPr>
-              <w:shd w:val="clear" w:color="auto" w:fill="FFFFFF" w:themeFill="background1"/>
-              <w:spacing w:line="312" w:lineRule="auto"/>
-              <w:ind w:leftChars="100" w:left="320"/>
-              <w:jc w:val="right"/>
-              <w:rPr>
-                <w:rFonts w:ascii="Times New Roman" w:hAnsi="Times New Roman"/>
-                <w:sz w:val="24"/>
-                <w:szCs w:val="24"/>
-              </w:rPr>
-            </w:pPr>
+            <w:r>
+              <w:t>{TongTienChuaVAT}</w:t>
+            </w:r>
           </w:p>
         </w:tc>
       </w:tr>
@@ -5667,17 +2963,9 @@
             <w:vAlign w:val="center"/>
           </w:tcPr>
           <w:p>
-            <w:pPr>
-              <w:shd w:val="clear" w:color="auto" w:fill="FFFFFF" w:themeFill="background1"/>
-              <w:spacing w:line="312" w:lineRule="auto"/>
-              <w:ind w:leftChars="100" w:left="320"/>
-              <w:jc w:val="right"/>
-              <w:rPr>
-                <w:rFonts w:ascii="Times New Roman" w:hAnsi="Times New Roman"/>
-                <w:sz w:val="24"/>
-                <w:szCs w:val="24"/>
-              </w:rPr>
-            </w:pPr>
+            <w:r>
+              <w:t>{VAT8}</w:t>
+            </w:r>
           </w:p>
         </w:tc>
       </w:tr>
@@ -5738,17 +3026,9 @@
             <w:vAlign w:val="center"/>
           </w:tcPr>
           <w:p>
-            <w:pPr>
-              <w:shd w:val="clear" w:color="auto" w:fill="FFFFFF" w:themeFill="background1"/>
-              <w:spacing w:line="312" w:lineRule="auto"/>
-              <w:ind w:leftChars="100" w:left="320"/>
-              <w:jc w:val="right"/>
-              <w:rPr>
-                <w:rFonts w:ascii="Times New Roman" w:hAnsi="Times New Roman"/>
-                <w:sz w:val="24"/>
-                <w:szCs w:val="24"/>
-              </w:rPr>
-            </w:pPr>
+            <w:r>
+              <w:t>{VAT10}</w:t>
+            </w:r>
           </w:p>
         </w:tc>
       </w:tr>
@@ -5811,17 +3091,9 @@
             <w:vAlign w:val="center"/>
           </w:tcPr>
           <w:p>
-            <w:pPr>
-              <w:shd w:val="clear" w:color="auto" w:fill="FFFFFF" w:themeFill="background1"/>
-              <w:spacing w:line="312" w:lineRule="auto"/>
-              <w:ind w:leftChars="100" w:left="320"/>
-              <w:jc w:val="right"/>
-              <w:rPr>
-                <w:rFonts w:ascii="Times New Roman" w:hAnsi="Times New Roman"/>
-                <w:sz w:val="24"/>
-                <w:szCs w:val="24"/>
-              </w:rPr>
-            </w:pPr>
+            <w:r>
+              <w:t>{TongTien}</w:t>
+            </w:r>
           </w:p>
         </w:tc>
       </w:tr>
@@ -6219,12 +3491,7 @@
         </w:rPr>
       </w:pPr>
       <w:r>
-        <w:rPr>
-          <w:rFonts w:ascii="Times New Roman" w:hAnsi="Times New Roman"/>
-          <w:sz w:val="26"/>
-          <w:szCs w:val="26"/>
-        </w:rPr>
-        <w:t>Trong thời hạn 03 (ba) ngày làm việc kể từ ngày ký Hợp đồng, Bên B đặt cọc cho Bên A số tiền tương đương 70% giá trị Hợp đồng tạm tính, tương ứng số tiền: .......... VNĐ (Bằng chữ: .................).</w:t>
+        <w:t>Trong thời hạn 03 (ba) ngày làm việc kể từ ngày ký Hợp đồng, Bên B đặt cọc cho Bên A số tiền tương đương 70% giá trị Hợp đồng tạm tính, tương ứng số tiền: {Coc_Lan1_SoTien} VNĐ (Bằng chữ: {Coc_Lan1_BangChu}).</w:t>
       </w:r>
     </w:p>
     <w:p>
@@ -7020,26 +4287,7 @@
         </w:rPr>
       </w:pPr>
       <w:r>
-        <w:rPr>
-          <w:rFonts w:ascii="Times New Roman" w:eastAsia="TimesNewRomanPS-BoldMT" w:hAnsi="Times New Roman"/>
-          <w:b/>
-          <w:bCs/>
-          <w:sz w:val="26"/>
-          <w:szCs w:val="26"/>
-          <w:lang w:eastAsia="zh-CN" w:bidi="ar"/>
-        </w:rPr>
-        <w:t xml:space="preserve">CÔNG TY </w:t>
-      </w:r>
-      <w:r>
-        <w:rPr>
-          <w:rFonts w:ascii="Times New Roman" w:eastAsia="TimesNewRomanPS-BoldMT" w:hAnsi="Times New Roman"/>
-          <w:b/>
-          <w:bCs/>
-          <w:sz w:val="26"/>
-          <w:szCs w:val="26"/>
-          <w:lang w:eastAsia="zh-CN" w:bidi="ar"/>
-        </w:rPr>
-        <w:t>……..</w:t>
+        <w:t>CÔNG TY {ThoiGianThaoDo}.</w:t>
       </w:r>
     </w:p>
     <w:p>
@@ -7055,22 +4303,7 @@
         </w:rPr>
       </w:pPr>
       <w:r>
-        <w:rPr>
-          <w:rFonts w:ascii="Times New Roman" w:eastAsia="SimSun" w:hAnsi="Times New Roman"/>
-          <w:sz w:val="26"/>
-          <w:szCs w:val="26"/>
-          <w:lang w:eastAsia="zh-CN" w:bidi="ar"/>
-        </w:rPr>
-        <w:t>Địa chỉ :</w:t>
-      </w:r>
-      <w:r>
-        <w:rPr>
-          <w:rFonts w:ascii="Times New Roman" w:eastAsia="SimSun" w:hAnsi="Times New Roman"/>
-          <w:sz w:val="26"/>
-          <w:szCs w:val="26"/>
-          <w:lang w:eastAsia="zh-CN" w:bidi="ar"/>
-        </w:rPr>
-        <w:t>……….</w:t>
+        <w:t>Địa chỉ :…{ThoiGianThaoDo}</w:t>
       </w:r>
     </w:p>
     <w:p>
@@ -7141,22 +4374,7 @@
         </w:rPr>
       </w:pPr>
       <w:r>
-        <w:rPr>
-          <w:rFonts w:ascii="Times New Roman" w:eastAsia="SimSun" w:hAnsi="Times New Roman"/>
-          <w:sz w:val="26"/>
-          <w:szCs w:val="26"/>
-          <w:lang w:eastAsia="zh-CN" w:bidi="ar"/>
-        </w:rPr>
-        <w:t xml:space="preserve">Email nhận hóa đơn GTGT: </w:t>
-      </w:r>
-      <w:r>
-        <w:rPr>
-          <w:rFonts w:ascii="Times New Roman" w:eastAsia="SimSun" w:hAnsi="Times New Roman"/>
-          <w:sz w:val="26"/>
-          <w:szCs w:val="26"/>
-          <w:lang w:eastAsia="zh-CN" w:bidi="ar"/>
-        </w:rPr>
-        <w:t>……….</w:t>
+        <w:t>Email nhận hóa đơn GTGT: …{ThoiGianThaoDo}</w:t>
       </w:r>
     </w:p>
     <w:p>

</xml_diff>

<commit_message>
feat: add API stored procedures for managing wedding contracts and update database schema for Unicode support
</commit_message>
<xml_diff>
--- a/backend-app/samples/FILE MAU HOP DONG CÒN LẠI/2.1 MAU HDONG - 0406 (TRIỂN LÃM + TIỆC).docx
+++ b/backend-app/samples/FILE MAU HOP DONG CÒN LẠI/2.1 MAU HDONG - 0406 (TRIỂN LÃM + TIỆC).docx
@@ -1264,7 +1264,7 @@
           <w:szCs w:val="26"/>
           <w:lang w:eastAsia="zh-CN" w:bidi="ar"/>
         </w:rPr>
-        <w:t>{TiecSanhTiec}</w:t>
+        <w:t>{SanhTiec}</w:t>
       </w:r>
     </w:p>
     <w:p>
@@ -1581,7 +1581,27 @@
           <w:szCs w:val="26"/>
           <w:lang w:eastAsia="zh-CN" w:bidi="ar"/>
         </w:rPr>
-        <w:t>{TiecSanhTiec</w:t>
+        <w:t>{T</w:t>
+      </w:r>
+      <w:r>
+        <w:rPr>
+          <w:rFonts w:hint="default" w:ascii="Times New Roman" w:hAnsi="Times New Roman" w:eastAsia="SimSun"/>
+          <w:sz w:val="26"/>
+          <w:szCs w:val="26"/>
+          <w:lang w:val="en-US" w:eastAsia="zh-CN" w:bidi="ar"/>
+        </w:rPr>
+        <w:t>en</w:t>
+      </w:r>
+      <w:bookmarkStart w:id="2" w:name="_GoBack"/>
+      <w:bookmarkEnd w:id="2"/>
+      <w:r>
+        <w:rPr>
+          <w:rFonts w:hint="default" w:ascii="Times New Roman" w:hAnsi="Times New Roman" w:eastAsia="SimSun"/>
+          <w:sz w:val="26"/>
+          <w:szCs w:val="26"/>
+          <w:lang w:eastAsia="zh-CN" w:bidi="ar"/>
+        </w:rPr>
+        <w:t>SanhTiec</w:t>
       </w:r>
       <w:r>
         <w:rPr>
@@ -2706,6 +2726,7 @@
             <w:insideH w:val="single" w:color="000000" w:sz="4" w:space="0"/>
             <w:insideV w:val="single" w:color="000000" w:sz="4" w:space="0"/>
           </w:tblBorders>
+          <w:shd w:val="clear" w:color="auto" w:fill="FFFFFF" w:themeFill="background1"/>
           <w:tblCellMar>
             <w:top w:w="0" w:type="dxa"/>
             <w:left w:w="0" w:type="dxa"/>
@@ -3591,8 +3612,6 @@
         </w:rPr>
         <w:t>{MucPhiPhucVu}</w:t>
       </w:r>
-      <w:bookmarkStart w:id="2" w:name="_GoBack"/>
-      <w:bookmarkEnd w:id="2"/>
       <w:r>
         <w:rPr>
           <w:rFonts w:ascii="Times New Roman" w:hAnsi="Times New Roman" w:eastAsia="TimesNewRomanPS-BoldMT"/>
@@ -4952,6 +4971,7 @@
       <w:pPr>
         <w:pStyle w:val="13"/>
         <w:numPr>
+          <w:ilvl w:val="0"/>
           <w:numId w:val="0"/>
         </w:numPr>
         <w:shd w:val="clear" w:color="auto" w:fill="FFFFFF" w:themeFill="background1"/>
@@ -14868,7 +14888,7 @@
     <w:lsdException w:unhideWhenUsed="0" w:uiPriority="0" w:semiHidden="0" w:name="HTML Sample"/>
     <w:lsdException w:unhideWhenUsed="0" w:uiPriority="0" w:semiHidden="0" w:name="HTML Typewriter"/>
     <w:lsdException w:unhideWhenUsed="0" w:uiPriority="0" w:semiHidden="0" w:name="HTML Variable"/>
-    <w:lsdException w:uiPriority="99" w:name="Normal Table"/>
+    <w:lsdException w:qFormat="1" w:uiPriority="99" w:name="Normal Table"/>
     <w:lsdException w:unhideWhenUsed="0" w:uiPriority="0" w:semiHidden="0" w:name="annotation subject"/>
     <w:lsdException w:uiPriority="0" w:name="Table Simple 1"/>
     <w:lsdException w:uiPriority="0" w:name="Table Simple 2"/>
@@ -15138,6 +15158,7 @@
     <w:name w:val="Normal Table"/>
     <w:semiHidden/>
     <w:unhideWhenUsed/>
+    <w:qFormat/>
     <w:uiPriority w:val="99"/>
     <w:tblPr>
       <w:tblCellMar>
@@ -15239,6 +15260,7 @@
     <w:basedOn w:val="7"/>
     <w:link w:val="3"/>
     <w:semiHidden/>
+    <w:qFormat/>
     <w:uiPriority w:val="0"/>
     <w:rPr>
       <w:rFonts w:asciiTheme="majorHAnsi" w:hAnsiTheme="majorHAnsi" w:eastAsiaTheme="majorEastAsia" w:cstheme="majorBidi"/>
@@ -15252,6 +15274,7 @@
   <w:style w:type="paragraph" w:customStyle="1" w:styleId="16">
     <w:name w:val="isselectedend"/>
     <w:basedOn w:val="1"/>
+    <w:qFormat/>
     <w:uiPriority w:val="0"/>
     <w:pPr>
       <w:spacing w:before="100" w:beforeAutospacing="1" w:after="100" w:afterAutospacing="1"/>

</xml_diff>

<commit_message>
feat: implement PromotionAutoFillPlugin to automate promo lookups and hall capacity validation across banquet forms
</commit_message>
<xml_diff>
--- a/backend-app/samples/FILE MAU HOP DONG CÒN LẠI/2.1 MAU HDONG - 0406 (TRIỂN LÃM + TIỆC).docx
+++ b/backend-app/samples/FILE MAU HOP DONG CÒN LẠI/2.1 MAU HDONG - 0406 (TRIỂN LÃM + TIỆC).docx
@@ -1,6 +1,6 @@
 
 <file path=word/document.xml><?xml version="1.0" encoding="utf-8"?>
-<w:document xmlns:wpc="http://schemas.microsoft.com/office/word/2010/wordprocessingCanvas" xmlns:mc="http://schemas.openxmlformats.org/markup-compatibility/2006" xmlns:o="urn:schemas-microsoft-com:office:office" xmlns:r="http://schemas.openxmlformats.org/officeDocument/2006/relationships" xmlns:m="http://schemas.openxmlformats.org/officeDocument/2006/math" xmlns:v="urn:schemas-microsoft-com:vml" xmlns:wp14="http://schemas.microsoft.com/office/word/2010/wordprocessingDrawing" xmlns:wp="http://schemas.openxmlformats.org/drawingml/2006/wordprocessingDrawing" xmlns:w="http://schemas.openxmlformats.org/wordprocessingml/2006/main" xmlns:w14="http://schemas.microsoft.com/office/word/2010/wordml" xmlns:w10="urn:schemas-microsoft-com:office:word" xmlns:w15="http://schemas.microsoft.com/office/word/2012/wordml" xmlns:wpg="http://schemas.microsoft.com/office/word/2010/wordprocessingGroup" xmlns:wpi="http://schemas.microsoft.com/office/word/2010/wordprocessingInk" xmlns:wne="http://schemas.microsoft.com/office/word/2006/wordml" xmlns:wps="http://schemas.microsoft.com/office/word/2010/wordprocessingShape" xmlns:wpsCustomData="http://www.wps.cn/officeDocument/2013/wpsCustomData" mc:Ignorable="w14 w15 wp14">
+<w:document xmlns:wpc="http://schemas.microsoft.com/office/word/2010/wordprocessingCanvas" xmlns:mc="http://schemas.openxmlformats.org/markup-compatibility/2006" xmlns:o="urn:schemas-microsoft-com:office:office" xmlns:r="http://schemas.openxmlformats.org/officeDocument/2006/relationships" xmlns:m="http://schemas.openxmlformats.org/officeDocument/2006/math" xmlns:v="urn:schemas-microsoft-com:vml" xmlns:wp14="http://schemas.microsoft.com/office/word/2010/wordprocessingDrawing" xmlns:wp="http://schemas.openxmlformats.org/drawingml/2006/wordprocessingDrawing" xmlns:w="http://schemas.openxmlformats.org/wordprocessingml/2006/main" xmlns:w14="http://schemas.microsoft.com/office/word/2010/wordml" xmlns:w10="urn:schemas-microsoft-com:office:word" xmlns:w15="http://schemas.microsoft.com/office/word/2012/wordml" xmlns:wpg="http://schemas.microsoft.com/office/word/2010/wordprocessingGroup" xmlns:wpi="http://schemas.microsoft.com/office/word/2010/wordprocessingInk" xmlns:wne="http://schemas.microsoft.com/office/word/2006/wordml" xmlns:wps="http://schemas.microsoft.com/office/word/2010/wordprocessingShape" xmlns:wpsCustomData="http://www.wps.cn/officeDocument/2013/wpsCustomData" xmlns:a="http://schemas.openxmlformats.org/drawingml/2006/main" mc:Ignorable="w14 w15 wp14">
   <w:body>
     <w:p>
       <w:pPr>
@@ -85,7 +85,7 @@
                 <wp:wrapNone/>
                 <wp:docPr id="1" name="Straight Arrow Connector 1"/>
                 <wp:cNvGraphicFramePr/>
-                <a:graphic xmlns:a="http://schemas.openxmlformats.org/drawingml/2006/main">
+                <a:graphic>
                   <a:graphicData uri="http://schemas.microsoft.com/office/word/2010/wordprocessingShape">
                     <wps:wsp>
                       <wps:cNvCnPr/>
@@ -202,7 +202,7 @@
           <w:sz w:val="24"/>
           <w:szCs w:val="24"/>
         </w:rPr>
-        <w:t>Số: …</w:t>
+        <w:t>Số: {Sohopdong}</w:t>
       </w:r>
       <w:r>
         <w:rPr>
@@ -210,7 +210,7 @@
           <w:sz w:val="24"/>
           <w:szCs w:val="24"/>
         </w:rPr>
-        <w:t xml:space="preserve"> /CTY-HHKH/2025</w:t>
+        <w:t xml:space="preserve"/>
       </w:r>
     </w:p>
     <w:p>
@@ -1119,7 +1119,7 @@
           <w:szCs w:val="26"/>
           <w:lang w:eastAsia="zh-CN" w:bidi="ar"/>
         </w:rPr>
-        <w:t xml:space="preserve">- </w:t>
+        <w:t xml:space="preserve">- Địa điểm triển lãm: {DiaDiemTrienLam}</w:t>
       </w:r>
       <w:r>
         <w:rPr>
@@ -1130,7 +1130,7 @@
           <w:szCs w:val="26"/>
           <w:lang w:eastAsia="zh-CN" w:bidi="ar"/>
         </w:rPr>
-        <w:t>Địa điểm triển lãm</w:t>
+        <w:t/>
       </w:r>
       <w:r>
         <w:rPr>
@@ -1139,7 +1139,7 @@
           <w:szCs w:val="26"/>
           <w:lang w:eastAsia="zh-CN" w:bidi="ar"/>
         </w:rPr>
-        <w:t xml:space="preserve">: </w:t>
+        <w:t xml:space="preserve"/>
       </w:r>
       <w:r>
         <w:rPr>
@@ -1148,7 +1148,7 @@
           <w:szCs w:val="26"/>
           <w:lang w:eastAsia="zh-CN" w:bidi="ar"/>
         </w:rPr>
-        <w:t>{SanhTiec}</w:t>
+        <w:t/>
       </w:r>
     </w:p>
     <w:p>
@@ -1178,7 +1178,7 @@
           <w:sz w:val="26"/>
           <w:szCs w:val="26"/>
         </w:rPr>
-        <w:t>{SoKhachDiemDanh}</w:t>
+        <w:t xml:space="preserve">{SoKhachThamQuanDuKien}</w:t>
       </w:r>
       <w:r>
         <w:rPr>
@@ -1262,7 +1262,7 @@
           <w:szCs w:val="26"/>
           <w:lang w:eastAsia="zh-CN" w:bidi="ar"/>
         </w:rPr>
-        <w:t>{NgayLapHD}</w:t>
+        <w:t xml:space="preserve"> {NgaySetupTrienLam</w:t>
       </w:r>
       <w:r>
         <w:rPr>
@@ -1271,7 +1271,7 @@
           <w:szCs w:val="26"/>
           <w:lang w:eastAsia="zh-CN" w:bidi="ar"/>
         </w:rPr>
-        <w:t>tháng</w:t>
+        <w:t xml:space="preserve"/>
       </w:r>
       <w:r>
         <w:rPr>
@@ -1280,7 +1280,7 @@
           <w:szCs w:val="26"/>
           <w:lang w:eastAsia="zh-CN" w:bidi="ar"/>
         </w:rPr>
-        <w:t>{ThangLapHD}</w:t>
+        <w:t xml:space="preserve"/>
       </w:r>
       <w:r>
         <w:rPr>
@@ -1289,7 +1289,7 @@
           <w:szCs w:val="26"/>
           <w:lang w:eastAsia="zh-CN" w:bidi="ar"/>
         </w:rPr>
-        <w:t>năm</w:t>
+        <w:t xml:space="preserve"/>
       </w:r>
       <w:r>
         <w:rPr>
@@ -1298,7 +1298,7 @@
           <w:szCs w:val="26"/>
           <w:lang w:val="en-US" w:eastAsia="zh-CN" w:bidi="ar"/>
         </w:rPr>
-        <w:t>{NamLapHD}</w:t>
+        <w:t xml:space="preserve">}</w:t>
       </w:r>
     </w:p>
     <w:p>
@@ -1329,7 +1329,7 @@
           <w:szCs w:val="26"/>
           <w:lang w:eastAsia="zh-CN" w:bidi="ar"/>
         </w:rPr>
-        <w:t>{TiecGioBatDau}</w:t>
+        <w:t xml:space="preserve">{GioBatDauTrienLam} - {GioKetThucTrienLam} vào ngày {NgayTrienLam</w:t>
       </w:r>
       <w:r>
         <w:rPr>
@@ -1338,7 +1338,7 @@
           <w:szCs w:val="26"/>
           <w:lang w:eastAsia="zh-CN" w:bidi="ar"/>
         </w:rPr>
-        <w:t xml:space="preserve">- </w:t>
+        <w:t xml:space="preserve"/>
       </w:r>
       <w:r>
         <w:rPr>
@@ -1347,7 +1347,7 @@
           <w:szCs w:val="26"/>
           <w:lang w:eastAsia="zh-CN" w:bidi="ar"/>
         </w:rPr>
-        <w:t>{TiecGioKetThuc}</w:t>
+        <w:t xml:space="preserve"/>
       </w:r>
       <w:r>
         <w:rPr>
@@ -1356,7 +1356,7 @@
           <w:szCs w:val="26"/>
           <w:lang w:eastAsia="zh-CN" w:bidi="ar"/>
         </w:rPr>
-        <w:t xml:space="preserve"> vào Ngày</w:t>
+        <w:t xml:space="preserve"/>
       </w:r>
       <w:r>
         <w:rPr>
@@ -1365,7 +1365,7 @@
           <w:szCs w:val="26"/>
           <w:lang w:eastAsia="zh-CN" w:bidi="ar"/>
         </w:rPr>
-        <w:t>{NgayLapHD}</w:t>
+        <w:t xml:space="preserve"/>
       </w:r>
       <w:r>
         <w:rPr>
@@ -1374,7 +1374,7 @@
           <w:szCs w:val="26"/>
           <w:lang w:eastAsia="zh-CN" w:bidi="ar"/>
         </w:rPr>
-        <w:t>tháng</w:t>
+        <w:t xml:space="preserve"/>
       </w:r>
       <w:r>
         <w:rPr>
@@ -1383,7 +1383,7 @@
           <w:szCs w:val="26"/>
           <w:lang w:eastAsia="zh-CN" w:bidi="ar"/>
         </w:rPr>
-        <w:t>{ThangLapHD}</w:t>
+        <w:t xml:space="preserve"/>
       </w:r>
       <w:r>
         <w:rPr>
@@ -1392,7 +1392,7 @@
           <w:szCs w:val="26"/>
           <w:lang w:eastAsia="zh-CN" w:bidi="ar"/>
         </w:rPr>
-        <w:t>năm</w:t>
+        <w:t xml:space="preserve"/>
       </w:r>
       <w:r>
         <w:rPr>
@@ -1401,7 +1401,7 @@
           <w:szCs w:val="26"/>
           <w:lang w:eastAsia="zh-CN" w:bidi="ar"/>
         </w:rPr>
-        <w:t>{ThangLapHD}</w:t>
+        <w:t xml:space="preserve">}</w:t>
       </w:r>
     </w:p>
     <w:p>
@@ -1447,7 +1447,7 @@
           <w:szCs w:val="26"/>
           <w:lang w:eastAsia="zh-CN" w:bidi="ar"/>
         </w:rPr>
-        <w:t>- Địa điểm tiệc tối</w:t>
+        <w:t>- Địa điểm tiệc {BuoiTiec}: {DiaDiemTiec}</w:t>
       </w:r>
       <w:r>
         <w:rPr>
@@ -1456,7 +1456,7 @@
           <w:szCs w:val="26"/>
           <w:lang w:eastAsia="zh-CN" w:bidi="ar"/>
         </w:rPr>
-        <w:t>:</w:t>
+        <w:t/>
       </w:r>
       <w:r>
         <w:rPr>
@@ -1465,7 +1465,7 @@
           <w:szCs w:val="26"/>
           <w:lang w:eastAsia="zh-CN" w:bidi="ar"/>
         </w:rPr>
-        <w:t>{TenSanhTiecPhu}</w:t>
+        <w:t/>
       </w:r>
     </w:p>
     <w:p>
@@ -1743,7 +1743,7 @@
           <w:sz w:val="26"/>
           <w:szCs w:val="26"/>
         </w:rPr>
-        <w:t xml:space="preserve">+ Kích thước sân khấu </w:t>
+        <w:t xml:space="preserve">+ Kích thước sân khấu: {KichThuocSanKhau}</w:t>
       </w:r>
       <w:r>
         <w:rPr>
@@ -1753,7 +1753,7 @@
           <w:szCs w:val="26"/>
           <w:lang w:val="en-US"/>
         </w:rPr>
-        <w:t>{TenSanKhau}</w:t>
+        <w:t/>
       </w:r>
       <w:r>
         <w:rPr>
@@ -1764,7 +1764,7 @@
           <w:sz w:val="26"/>
           <w:szCs w:val="26"/>
         </w:rPr>
-        <w:t xml:space="preserve">: </w:t>
+        <w:t xml:space="preserve"/>
       </w:r>
       <w:r>
         <w:rPr>
@@ -1774,7 +1774,7 @@
           <w:szCs w:val="26"/>
           <w:lang w:val="en-US"/>
         </w:rPr>
-        <w:t>{KichThuocSanKhau}</w:t>
+        <w:t/>
       </w:r>
     </w:p>
     <w:p>
@@ -1950,7 +1950,7 @@
           <w:szCs w:val="26"/>
           <w:lang w:eastAsia="zh-CN"/>
         </w:rPr>
-        <w:t xml:space="preserve">+ Kích thươc sân khấu </w:t>
+        <w:t xml:space="preserve">+ Kích thươc sân khấu: {KichThuocSanKhauPhu}</w:t>
       </w:r>
       <w:r>
         <w:rPr>
@@ -1960,7 +1960,7 @@
           <w:szCs w:val="26"/>
           <w:lang w:val="en-US"/>
         </w:rPr>
-        <w:t>{TenSanKhauPhu}</w:t>
+        <w:t/>
       </w:r>
       <w:r>
         <w:rPr>
@@ -1972,7 +1972,7 @@
           <w:szCs w:val="26"/>
           <w:lang w:eastAsia="zh-CN"/>
         </w:rPr>
-        <w:t xml:space="preserve">: </w:t>
+        <w:t xml:space="preserve"/>
       </w:r>
       <w:r>
         <w:rPr>
@@ -1982,7 +1982,7 @@
           <w:szCs w:val="26"/>
           <w:lang w:val="en-US"/>
         </w:rPr>
-        <w:t>{KichThuocSanKhauPhu}</w:t>
+        <w:t/>
       </w:r>
     </w:p>
     <w:p>
@@ -3146,7 +3146,7 @@
                 <w:szCs w:val="26"/>
                 <w:lang w:eastAsia="zh-CN" w:bidi="ar"/>
               </w:rPr>
-              <w:t xml:space="preserve">17.500.000VNĐ++/giờ/sảnh </w:t>
+              <w:t xml:space="preserve">{PhiThueSanhNgoaiGio} </w:t>
             </w:r>
           </w:p>
         </w:tc>
@@ -5120,7 +5120,7 @@
           <w:sz w:val="26"/>
           <w:szCs w:val="26"/>
         </w:rPr>
-        <w:t xml:space="preserve">Trong thời hạn 03 (ba) ngày làm việc kể từ ngày ký Hợp đồng, Bên B đặt cọc cho Bên A số tiền tương đương 70% giá trị Hợp đồng tạm tính, tương ứng số tiền: </w:t>
+        <w:t xml:space="preserve">Trong thời hạn 03 (ba) ngày làm việc kể từ ngày ký Hợp đồng, Bên B đặt cọc cho Bên A số tiền: </w:t>
       </w:r>
       <w:r>
         <w:rPr>
@@ -5136,7 +5136,7 @@
           <w:sz w:val="26"/>
           <w:szCs w:val="26"/>
         </w:rPr>
-        <w:t xml:space="preserve"> VNĐ (Bằng chữ: </w:t>
+        <w:t xml:space="preserve"> (Bằng chữ: </w:t>
       </w:r>
       <w:r>
         <w:rPr>
@@ -6049,7 +6049,7 @@
           <w:szCs w:val="26"/>
           <w:lang w:eastAsia="zh-CN" w:bidi="ar"/>
         </w:rPr>
-        <w:t>Nội dung xuất: Dịch vụ cho thuê địa điểm tổ chức sự kiện và các dịch vụ đi kèm theo HĐ số …</w:t>
+        <w:t>Nội dung xuất: {#NoiDungXuatHoaDon}{NoiDungXuatHoaDon}{/NoiDungXuatHoaDon}{^NoiDungXuatHoaDon}Dịch vụ cho thuê địa điểm tổ chức sự kiện và các dịch vụ đi kèm theo HĐ số {Sohopdong} ký ngày {NgayLapHD}/{ThangLapHD}/{NamLapHD} và Biên bản nghiệm thu và Quyết toán dịch vụ số … ký ngày …{/NoiDungXuatHoaDon}</w:t>
       </w:r>
       <w:r>
         <w:rPr>
@@ -6060,7 +6060,7 @@
           <w:szCs w:val="26"/>
           <w:lang w:eastAsia="zh-CN" w:bidi="ar"/>
         </w:rPr>
-        <w:t>/CTY-HHKH/2025 ký ngày…và Biên bản nghiệm thu và Quyết toán dịch vụ số … ……………ký ngày………</w:t>
+        <w:t xml:space="preserve"/>
       </w:r>
     </w:p>
     <w:p>
@@ -11472,7 +11472,7 @@
           <w:szCs w:val="26"/>
           <w:lang w:eastAsia="zh-CN"/>
         </w:rPr>
-        <w:t>Người phụ trách giao dịch:</w:t>
+        <w:t>Người phụ trách giao dịch: {BenANguoiGiaoDich}</w:t>
       </w:r>
       <w:r>
         <w:rPr>
@@ -11481,7 +11481,7 @@
           <w:szCs w:val="26"/>
           <w:lang w:val="en-US" w:eastAsia="zh-CN"/>
         </w:rPr>
-        <w:t xml:space="preserve"> </w:t>
+        <w:t xml:space="preserve"/>
       </w:r>
       <w:r>
         <w:rPr>
@@ -11490,7 +11490,7 @@
           <w:szCs w:val="26"/>
           <w:lang w:eastAsia="zh-CN"/>
         </w:rPr>
-        <w:t>{BenANhanVienPhuTrach}</w:t>
+        <w:t/>
       </w:r>
     </w:p>
     <w:p>
@@ -11518,7 +11518,7 @@
           <w:szCs w:val="26"/>
           <w:lang w:eastAsia="zh-CN"/>
         </w:rPr>
-        <w:t>Chức vụ:</w:t>
+        <w:t>Chức vụ: {BenAChucVuGiaoDich}</w:t>
       </w:r>
       <w:r>
         <w:rPr>
@@ -11527,7 +11527,7 @@
           <w:szCs w:val="26"/>
           <w:lang w:val="en-US" w:eastAsia="zh-CN"/>
         </w:rPr>
-        <w:t xml:space="preserve"> </w:t>
+        <w:t xml:space="preserve"/>
       </w:r>
       <w:r>
         <w:rPr>
@@ -11536,7 +11536,7 @@
           <w:szCs w:val="26"/>
           <w:lang w:eastAsia="zh-CN"/>
         </w:rPr>
-        <w:t>{BenAChucVu}</w:t>
+        <w:t/>
       </w:r>
     </w:p>
     <w:p>

</xml_diff>